<commit_message>
Reorder resume sections and drop extra projects line
</commit_message>
<xml_diff>
--- a/Sarathkumar_Resume.docx
+++ b/Sarathkumar_Resume.docx
@@ -42,7 +42,7 @@
         <w:spacing w:after="10"/>
         <w:jc w:val="center"/>
       </w:pPr>
-      <w:hyperlink w:history="1" r:id="rIdmeesamsj811kaqfdqgumw">
+      <w:hyperlink w:history="1" r:id="rIdzeuqsnlbt0qp7vd-mt54k">
         <w:r>
           <w:rPr>
             <w:rFonts w:ascii="Calibri" w:cs="Calibri" w:eastAsia="Calibri" w:hAnsi="Calibri"/>
@@ -95,7 +95,7 @@
         <w:spacing w:after="40"/>
         <w:jc w:val="center"/>
       </w:pPr>
-      <w:hyperlink w:history="1" r:id="rIdgqe0zk6th37otwg8rjqka">
+      <w:hyperlink w:history="1" r:id="rIdpiyehavhy5hm8uu8y6koa">
         <w:r>
           <w:rPr>
             <w:rFonts w:ascii="Calibri" w:cs="Calibri" w:eastAsia="Calibri" w:hAnsi="Calibri"/>
@@ -115,7 +115,7 @@
         </w:rPr>
         <w:t xml:space="preserve">   |   </w:t>
       </w:r>
-      <w:hyperlink w:history="1" r:id="rIdigmsawq-sfue7nviqqbdn">
+      <w:hyperlink w:history="1" r:id="rIdqkgtfu0uwrwmgcyzyjbbc">
         <w:r>
           <w:rPr>
             <w:rFonts w:ascii="Calibri" w:cs="Calibri" w:eastAsia="Calibri" w:hAnsi="Calibri"/>
@@ -135,7 +135,7 @@
         </w:rPr>
         <w:t xml:space="preserve">   |   </w:t>
       </w:r>
-      <w:hyperlink w:history="1" r:id="rIdtwctvc1hd4zgp7xpicyyr">
+      <w:hyperlink w:history="1" r:id="rId4uwepsjuulbbg7ivs8bdd">
         <w:r>
           <w:rPr>
             <w:rFonts w:ascii="Calibri" w:cs="Calibri" w:eastAsia="Calibri" w:hAnsi="Calibri"/>
@@ -409,7 +409,7 @@
           <w:sz w:val="21"/>
           <w:szCs w:val="21"/>
         </w:rPr>
-        <w:t xml:space="preserve">INTERNSHIP EXPERIENCE</w:t>
+        <w:t xml:space="preserve">PROJECTS</w:t>
       </w:r>
     </w:p>
     <w:p>
@@ -429,355 +429,6 @@
           <w:sz w:val="19"/>
           <w:szCs w:val="19"/>
         </w:rPr>
-        <w:t xml:space="preserve">AWS Cloud Intern</w:t>
-      </w:r>
-      <w:r>
-        <w:rPr>
-          <w:rFonts w:ascii="Calibri" w:cs="Calibri" w:eastAsia="Calibri" w:hAnsi="Calibri"/>
-          <w:color w:val="4B5563"/>
-          <w:sz w:val="19"/>
-          <w:szCs w:val="19"/>
-        </w:rPr>
-        <w:t xml:space="preserve">  —  BrainOVision Solutions</w:t>
-      </w:r>
-      <w:r>
-        <w:rPr>
-          <w:rFonts w:ascii="Calibri" w:cs="Calibri" w:eastAsia="Calibri" w:hAnsi="Calibri"/>
-          <w:color w:val="1F2937"/>
-          <w:sz w:val="19"/>
-          <w:szCs w:val="19"/>
-        </w:rPr>
-        <w:t xml:space="preserve">	</w:t>
-      </w:r>
-      <w:r>
-        <w:rPr>
-          <w:rFonts w:ascii="Calibri" w:cs="Calibri" w:eastAsia="Calibri" w:hAnsi="Calibri"/>
-          <w:b/>
-          <w:bCs/>
-          <w:color w:val="4B5563"/>
-          <w:sz w:val="18"/>
-          <w:szCs w:val="18"/>
-        </w:rPr>
-        <w:t xml:space="preserve">2 months</w:t>
-      </w:r>
-    </w:p>
-    <w:p>
-      <w:pPr>
-        <w:pStyle w:val="ListParagraph"/>
-        <w:numPr>
-          <w:ilvl w:val="0"/>
-          <w:numId w:val="2"/>
-        </w:numPr>
-        <w:spacing w:after="10"/>
-      </w:pPr>
-      <w:r>
-        <w:rPr>
-          <w:rFonts w:ascii="Calibri" w:cs="Calibri" w:eastAsia="Calibri" w:hAnsi="Calibri"/>
-          <w:color w:val="1F2937"/>
-          <w:sz w:val="19"/>
-          <w:szCs w:val="19"/>
-        </w:rPr>
-        <w:t xml:space="preserve">Deployed applications on AWS EC2, managed S3 storage and explored IAM roles.</w:t>
-      </w:r>
-    </w:p>
-    <w:p>
-      <w:pPr>
-        <w:pStyle w:val="ListParagraph"/>
-        <w:numPr>
-          <w:ilvl w:val="0"/>
-          <w:numId w:val="2"/>
-        </w:numPr>
-        <w:spacing w:after="10"/>
-      </w:pPr>
-      <w:r>
-        <w:rPr>
-          <w:rFonts w:ascii="Calibri" w:cs="Calibri" w:eastAsia="Calibri" w:hAnsi="Calibri"/>
-          <w:color w:val="1F2937"/>
-          <w:sz w:val="19"/>
-          <w:szCs w:val="19"/>
-        </w:rPr>
-        <w:t xml:space="preserve">Gained hands-on experience with cloud infrastructure setup and monitoring.</w:t>
-      </w:r>
-    </w:p>
-    <w:p>
-      <w:pPr>
-        <w:keepNext/>
-        <w:tabs>
-          <w:tab w:val="right" w:pos="10326"/>
-        </w:tabs>
-        <w:spacing w:before="80" w:after="0"/>
-      </w:pPr>
-      <w:r>
-        <w:rPr>
-          <w:rFonts w:ascii="Calibri" w:cs="Calibri" w:eastAsia="Calibri" w:hAnsi="Calibri"/>
-          <w:b/>
-          <w:bCs/>
-          <w:color w:val="1F2937"/>
-          <w:sz w:val="19"/>
-          <w:szCs w:val="19"/>
-        </w:rPr>
-        <w:t xml:space="preserve">Data Science &amp; Machine Learning Intern</w:t>
-      </w:r>
-      <w:r>
-        <w:rPr>
-          <w:rFonts w:ascii="Calibri" w:cs="Calibri" w:eastAsia="Calibri" w:hAnsi="Calibri"/>
-          <w:color w:val="4B5563"/>
-          <w:sz w:val="19"/>
-          <w:szCs w:val="19"/>
-        </w:rPr>
-        <w:t xml:space="preserve">  —  APSCHE</w:t>
-      </w:r>
-      <w:r>
-        <w:rPr>
-          <w:rFonts w:ascii="Calibri" w:cs="Calibri" w:eastAsia="Calibri" w:hAnsi="Calibri"/>
-          <w:color w:val="1F2937"/>
-          <w:sz w:val="19"/>
-          <w:szCs w:val="19"/>
-        </w:rPr>
-        <w:t xml:space="preserve">	</w:t>
-      </w:r>
-      <w:r>
-        <w:rPr>
-          <w:rFonts w:ascii="Calibri" w:cs="Calibri" w:eastAsia="Calibri" w:hAnsi="Calibri"/>
-          <w:b/>
-          <w:bCs/>
-          <w:color w:val="4B5563"/>
-          <w:sz w:val="18"/>
-          <w:szCs w:val="18"/>
-        </w:rPr>
-        <w:t xml:space="preserve">6 months</w:t>
-      </w:r>
-    </w:p>
-    <w:p>
-      <w:pPr>
-        <w:pStyle w:val="ListParagraph"/>
-        <w:numPr>
-          <w:ilvl w:val="0"/>
-          <w:numId w:val="2"/>
-        </w:numPr>
-        <w:spacing w:after="10"/>
-      </w:pPr>
-      <w:r>
-        <w:rPr>
-          <w:rFonts w:ascii="Calibri" w:cs="Calibri" w:eastAsia="Calibri" w:hAnsi="Calibri"/>
-          <w:color w:val="1F2937"/>
-          <w:sz w:val="19"/>
-          <w:szCs w:val="19"/>
-        </w:rPr>
-        <w:t xml:space="preserve">Worked on predictive modeling and AI-based solutions for real-world applications.</w:t>
-      </w:r>
-    </w:p>
-    <w:p>
-      <w:pPr>
-        <w:pStyle w:val="ListParagraph"/>
-        <w:numPr>
-          <w:ilvl w:val="0"/>
-          <w:numId w:val="2"/>
-        </w:numPr>
-        <w:spacing w:after="10"/>
-      </w:pPr>
-      <w:r>
-        <w:rPr>
-          <w:rFonts w:ascii="Calibri" w:cs="Calibri" w:eastAsia="Calibri" w:hAnsi="Calibri"/>
-          <w:color w:val="1F2937"/>
-          <w:sz w:val="19"/>
-          <w:szCs w:val="19"/>
-        </w:rPr>
-        <w:t xml:space="preserve">Applied ML algorithms to datasets and improved accuracy through data preprocessing.</w:t>
-      </w:r>
-    </w:p>
-    <w:p>
-      <w:pPr>
-        <w:keepNext/>
-        <w:tabs>
-          <w:tab w:val="right" w:pos="10326"/>
-        </w:tabs>
-        <w:spacing w:before="80" w:after="0"/>
-      </w:pPr>
-      <w:r>
-        <w:rPr>
-          <w:rFonts w:ascii="Calibri" w:cs="Calibri" w:eastAsia="Calibri" w:hAnsi="Calibri"/>
-          <w:b/>
-          <w:bCs/>
-          <w:color w:val="1F2937"/>
-          <w:sz w:val="19"/>
-          <w:szCs w:val="19"/>
-        </w:rPr>
-        <w:t xml:space="preserve">Python Developer Intern</w:t>
-      </w:r>
-      <w:r>
-        <w:rPr>
-          <w:rFonts w:ascii="Calibri" w:cs="Calibri" w:eastAsia="Calibri" w:hAnsi="Calibri"/>
-          <w:color w:val="4B5563"/>
-          <w:sz w:val="19"/>
-          <w:szCs w:val="19"/>
-        </w:rPr>
-        <w:t xml:space="preserve">  —  BrainOVision Solutions</w:t>
-      </w:r>
-      <w:r>
-        <w:rPr>
-          <w:rFonts w:ascii="Calibri" w:cs="Calibri" w:eastAsia="Calibri" w:hAnsi="Calibri"/>
-          <w:color w:val="1F2937"/>
-          <w:sz w:val="19"/>
-          <w:szCs w:val="19"/>
-        </w:rPr>
-        <w:t xml:space="preserve">	</w:t>
-      </w:r>
-      <w:r>
-        <w:rPr>
-          <w:rFonts w:ascii="Calibri" w:cs="Calibri" w:eastAsia="Calibri" w:hAnsi="Calibri"/>
-          <w:b/>
-          <w:bCs/>
-          <w:color w:val="4B5563"/>
-          <w:sz w:val="18"/>
-          <w:szCs w:val="18"/>
-        </w:rPr>
-        <w:t xml:space="preserve">2 months</w:t>
-      </w:r>
-    </w:p>
-    <w:p>
-      <w:pPr>
-        <w:pStyle w:val="ListParagraph"/>
-        <w:numPr>
-          <w:ilvl w:val="0"/>
-          <w:numId w:val="2"/>
-        </w:numPr>
-        <w:spacing w:after="10"/>
-      </w:pPr>
-      <w:r>
-        <w:rPr>
-          <w:rFonts w:ascii="Calibri" w:cs="Calibri" w:eastAsia="Calibri" w:hAnsi="Calibri"/>
-          <w:color w:val="1F2937"/>
-          <w:sz w:val="19"/>
-          <w:szCs w:val="19"/>
-        </w:rPr>
-        <w:t xml:space="preserve">Developed automation scripts and small-scale applications in Python.</w:t>
-      </w:r>
-    </w:p>
-    <w:p>
-      <w:pPr>
-        <w:pStyle w:val="ListParagraph"/>
-        <w:numPr>
-          <w:ilvl w:val="0"/>
-          <w:numId w:val="2"/>
-        </w:numPr>
-        <w:spacing w:after="10"/>
-      </w:pPr>
-      <w:r>
-        <w:rPr>
-          <w:rFonts w:ascii="Calibri" w:cs="Calibri" w:eastAsia="Calibri" w:hAnsi="Calibri"/>
-          <w:color w:val="1F2937"/>
-          <w:sz w:val="19"/>
-          <w:szCs w:val="19"/>
-        </w:rPr>
-        <w:t xml:space="preserve">Improved program efficiency with optimized coding practices.</w:t>
-      </w:r>
-    </w:p>
-    <w:p>
-      <w:pPr>
-        <w:keepNext/>
-        <w:tabs>
-          <w:tab w:val="right" w:pos="10326"/>
-        </w:tabs>
-        <w:spacing w:before="80" w:after="0"/>
-      </w:pPr>
-      <w:r>
-        <w:rPr>
-          <w:rFonts w:ascii="Calibri" w:cs="Calibri" w:eastAsia="Calibri" w:hAnsi="Calibri"/>
-          <w:b/>
-          <w:bCs/>
-          <w:color w:val="1F2937"/>
-          <w:sz w:val="19"/>
-          <w:szCs w:val="19"/>
-        </w:rPr>
-        <w:t xml:space="preserve">Industrial Training</w:t>
-      </w:r>
-      <w:r>
-        <w:rPr>
-          <w:rFonts w:ascii="Calibri" w:cs="Calibri" w:eastAsia="Calibri" w:hAnsi="Calibri"/>
-          <w:color w:val="4B5563"/>
-          <w:sz w:val="19"/>
-          <w:szCs w:val="19"/>
-        </w:rPr>
-        <w:t xml:space="preserve">  —  APSPHC</w:t>
-      </w:r>
-      <w:r>
-        <w:rPr>
-          <w:rFonts w:ascii="Calibri" w:cs="Calibri" w:eastAsia="Calibri" w:hAnsi="Calibri"/>
-          <w:color w:val="1F2937"/>
-          <w:sz w:val="19"/>
-          <w:szCs w:val="19"/>
-        </w:rPr>
-        <w:t xml:space="preserve">	</w:t>
-      </w:r>
-      <w:r>
-        <w:rPr>
-          <w:rFonts w:ascii="Calibri" w:cs="Calibri" w:eastAsia="Calibri" w:hAnsi="Calibri"/>
-          <w:b/>
-          <w:bCs/>
-          <w:color w:val="4B5563"/>
-          <w:sz w:val="18"/>
-          <w:szCs w:val="18"/>
-        </w:rPr>
-        <w:t xml:space="preserve">6 months</w:t>
-      </w:r>
-    </w:p>
-    <w:p>
-      <w:pPr>
-        <w:pStyle w:val="ListParagraph"/>
-        <w:numPr>
-          <w:ilvl w:val="0"/>
-          <w:numId w:val="2"/>
-        </w:numPr>
-        <w:spacing w:after="10"/>
-      </w:pPr>
-      <w:r>
-        <w:rPr>
-          <w:rFonts w:ascii="Calibri" w:cs="Calibri" w:eastAsia="Calibri" w:hAnsi="Calibri"/>
-          <w:color w:val="1F2937"/>
-          <w:sz w:val="19"/>
-          <w:szCs w:val="19"/>
-        </w:rPr>
-        <w:t xml:space="preserve">Gained exposure to infrastructure and technical workflows in public sector projects.</w:t>
-      </w:r>
-    </w:p>
-    <w:p>
-      <w:pPr>
-        <w:pBdr>
-          <w:bottom w:val="single" w:color="3B5BDB" w:sz="6" w:space="2"/>
-        </w:pBdr>
-        <w:spacing w:before="150" w:after="70"/>
-      </w:pPr>
-      <w:r>
-        <w:rPr>
-          <w:rFonts w:ascii="Calibri" w:cs="Calibri" w:eastAsia="Calibri" w:hAnsi="Calibri"/>
-          <w:b/>
-          <w:bCs/>
-          <w:color w:val="3B5BDB"/>
-          <w:spacing w:val="20"/>
-          <w:sz w:val="21"/>
-          <w:szCs w:val="21"/>
-        </w:rPr>
-        <w:t xml:space="preserve">PROJECTS</w:t>
-      </w:r>
-    </w:p>
-    <w:p>
-      <w:pPr>
-        <w:keepNext/>
-        <w:tabs>
-          <w:tab w:val="right" w:pos="10326"/>
-        </w:tabs>
-        <w:spacing w:before="40" w:after="0"/>
-      </w:pPr>
-      <w:r>
-        <w:rPr>
-          <w:rFonts w:ascii="Calibri" w:cs="Calibri" w:eastAsia="Calibri" w:hAnsi="Calibri"/>
-          <w:b/>
-          <w:bCs/>
-          <w:color w:val="1F2937"/>
-          <w:sz w:val="19"/>
-          <w:szCs w:val="19"/>
-        </w:rPr>
         <w:t xml:space="preserve">Construction Site Safety Monitor</w:t>
       </w:r>
       <w:r>
@@ -789,7 +440,7 @@
         </w:rPr>
         <w:t xml:space="preserve">   </w:t>
       </w:r>
-      <w:hyperlink w:history="1" r:id="rIda5mha9q1lxs_j5sjywkcw">
+      <w:hyperlink w:history="1" r:id="rIdgow1bo2pdfmxdwlt3kraw">
         <w:r>
           <w:rPr>
             <w:rFonts w:ascii="Calibri" w:cs="Calibri" w:eastAsia="Calibri" w:hAnsi="Calibri"/>
@@ -809,7 +460,7 @@
         </w:rPr>
         <w:t xml:space="preserve">  ·  </w:t>
       </w:r>
-      <w:hyperlink w:history="1" r:id="rIdbqlw_99elbs0lxjly8iqu">
+      <w:hyperlink w:history="1" r:id="rIdrwvsbwx9nyzo3gq6t4i0-">
         <w:r>
           <w:rPr>
             <w:rFonts w:ascii="Calibri" w:cs="Calibri" w:eastAsia="Calibri" w:hAnsi="Calibri"/>
@@ -952,7 +603,7 @@
         </w:rPr>
         <w:t xml:space="preserve">   </w:t>
       </w:r>
-      <w:hyperlink w:history="1" r:id="rId3geqj0ifvgbenniuytsxu">
+      <w:hyperlink w:history="1" r:id="rId4wdwpjpzbshntheoqfgqb">
         <w:r>
           <w:rPr>
             <w:rFonts w:ascii="Calibri" w:cs="Calibri" w:eastAsia="Calibri" w:hAnsi="Calibri"/>
@@ -1076,7 +727,7 @@
         </w:rPr>
         <w:t xml:space="preserve">   </w:t>
       </w:r>
-      <w:hyperlink w:history="1" r:id="rIdw37q-qv_ywq2thkpfklj8">
+      <w:hyperlink w:history="1" r:id="rIdhh2diwkjcbtuxopg_vwwf">
         <w:r>
           <w:rPr>
             <w:rFonts w:ascii="Calibri" w:cs="Calibri" w:eastAsia="Calibri" w:hAnsi="Calibri"/>
@@ -1174,102 +825,6 @@
     </w:p>
     <w:p>
       <w:pPr>
-        <w:spacing w:before="70" w:after="10"/>
-      </w:pPr>
-      <w:r>
-        <w:rPr>
-          <w:rFonts w:ascii="Calibri" w:cs="Calibri" w:eastAsia="Calibri" w:hAnsi="Calibri"/>
-          <w:b/>
-          <w:bCs/>
-          <w:color w:val="1F2937"/>
-          <w:sz w:val="19"/>
-          <w:szCs w:val="19"/>
-        </w:rPr>
-        <w:t xml:space="preserve">More: </w:t>
-      </w:r>
-      <w:hyperlink w:history="1" r:id="rIdvc0d-dhbkaf-xoozixtor">
-        <w:r>
-          <w:rPr>
-            <w:rFonts w:ascii="Calibri" w:cs="Calibri" w:eastAsia="Calibri" w:hAnsi="Calibri"/>
-            <w:color w:val="3B5BDB"/>
-            <w:sz w:val="19"/>
-            <w:szCs w:val="19"/>
-          </w:rPr>
-          <w:t xml:space="preserve">SVM from scratch</w:t>
-        </w:r>
-      </w:hyperlink>
-      <w:r>
-        <w:rPr>
-          <w:rFonts w:ascii="Calibri" w:cs="Calibri" w:eastAsia="Calibri" w:hAnsi="Calibri"/>
-          <w:color w:val="1F2937"/>
-          <w:sz w:val="19"/>
-          <w:szCs w:val="19"/>
-        </w:rPr>
-        <w:t xml:space="preserve"> (CVXOPT, pulsar classification)  ·  </w:t>
-      </w:r>
-      <w:hyperlink w:history="1" r:id="rIdo9tqzuz6jv2no-fjymbim">
-        <w:r>
-          <w:rPr>
-            <w:rFonts w:ascii="Calibri" w:cs="Calibri" w:eastAsia="Calibri" w:hAnsi="Calibri"/>
-            <w:color w:val="3B5BDB"/>
-            <w:sz w:val="19"/>
-            <w:szCs w:val="19"/>
-          </w:rPr>
-          <w:t xml:space="preserve">AlexNet on MNIST</w:t>
-        </w:r>
-      </w:hyperlink>
-      <w:r>
-        <w:rPr>
-          <w:rFonts w:ascii="Calibri" w:cs="Calibri" w:eastAsia="Calibri" w:hAnsi="Calibri"/>
-          <w:color w:val="1F2937"/>
-          <w:sz w:val="19"/>
-          <w:szCs w:val="19"/>
-        </w:rPr>
-        <w:t xml:space="preserve"> (PyTorch)  ·  </w:t>
-      </w:r>
-      <w:hyperlink w:history="1" r:id="rIdst2cv2gxricxrvbskq1tk">
-        <w:r>
-          <w:rPr>
-            <w:rFonts w:ascii="Calibri" w:cs="Calibri" w:eastAsia="Calibri" w:hAnsi="Calibri"/>
-            <w:color w:val="3B5BDB"/>
-            <w:sz w:val="19"/>
-            <w:szCs w:val="19"/>
-          </w:rPr>
-          <w:t xml:space="preserve">K-Means clustering</w:t>
-        </w:r>
-      </w:hyperlink>
-      <w:r>
-        <w:rPr>
-          <w:rFonts w:ascii="Calibri" w:cs="Calibri" w:eastAsia="Calibri" w:hAnsi="Calibri"/>
-          <w:color w:val="1F2937"/>
-          <w:sz w:val="19"/>
-          <w:szCs w:val="19"/>
-        </w:rPr>
-        <w:t xml:space="preserve"> (scikit-learn)  ·  </w:t>
-      </w:r>
-      <w:hyperlink w:history="1" r:id="rId5vtm-ck555e9gmvmqsgxr">
-        <w:r>
-          <w:rPr>
-            <w:rFonts w:ascii="Calibri" w:cs="Calibri" w:eastAsia="Calibri" w:hAnsi="Calibri"/>
-            <w:color w:val="3B5BDB"/>
-            <w:sz w:val="19"/>
-            <w:szCs w:val="19"/>
-          </w:rPr>
-          <w:t xml:space="preserve">Smart Study Planner</w:t>
-        </w:r>
-      </w:hyperlink>
-      <w:r>
-        <w:rPr>
-          <w:rFonts w:ascii="Calibri" w:cs="Calibri" w:eastAsia="Calibri" w:hAnsi="Calibri"/>
-          <w:color w:val="1F2937"/>
-          <w:sz w:val="19"/>
-          <w:szCs w:val="19"/>
-        </w:rPr>
-        <w:t xml:space="preserve"> (HTML, CSS, JS)</w:t>
-      </w:r>
-    </w:p>
-    <w:p>
-      <w:pPr>
         <w:pBdr>
           <w:bottom w:val="single" w:color="3B5BDB" w:sz="6" w:space="2"/>
         </w:pBdr>
@@ -1466,6 +1021,355 @@
           <w:szCs w:val="18"/>
         </w:rPr>
         <w:t xml:space="preserve">2017 – 2020</w:t>
+      </w:r>
+    </w:p>
+    <w:p>
+      <w:pPr>
+        <w:pBdr>
+          <w:bottom w:val="single" w:color="3B5BDB" w:sz="6" w:space="2"/>
+        </w:pBdr>
+        <w:spacing w:before="150" w:after="70"/>
+      </w:pPr>
+      <w:r>
+        <w:rPr>
+          <w:rFonts w:ascii="Calibri" w:cs="Calibri" w:eastAsia="Calibri" w:hAnsi="Calibri"/>
+          <w:b/>
+          <w:bCs/>
+          <w:color w:val="3B5BDB"/>
+          <w:spacing w:val="20"/>
+          <w:sz w:val="21"/>
+          <w:szCs w:val="21"/>
+        </w:rPr>
+        <w:t xml:space="preserve">INTERNSHIPS</w:t>
+      </w:r>
+    </w:p>
+    <w:p>
+      <w:pPr>
+        <w:keepNext/>
+        <w:tabs>
+          <w:tab w:val="right" w:pos="10326"/>
+        </w:tabs>
+        <w:spacing w:before="40" w:after="0"/>
+      </w:pPr>
+      <w:r>
+        <w:rPr>
+          <w:rFonts w:ascii="Calibri" w:cs="Calibri" w:eastAsia="Calibri" w:hAnsi="Calibri"/>
+          <w:b/>
+          <w:bCs/>
+          <w:color w:val="1F2937"/>
+          <w:sz w:val="19"/>
+          <w:szCs w:val="19"/>
+        </w:rPr>
+        <w:t xml:space="preserve">AWS Cloud Intern</w:t>
+      </w:r>
+      <w:r>
+        <w:rPr>
+          <w:rFonts w:ascii="Calibri" w:cs="Calibri" w:eastAsia="Calibri" w:hAnsi="Calibri"/>
+          <w:color w:val="4B5563"/>
+          <w:sz w:val="19"/>
+          <w:szCs w:val="19"/>
+        </w:rPr>
+        <w:t xml:space="preserve">  —  BrainOVision Solutions</w:t>
+      </w:r>
+      <w:r>
+        <w:rPr>
+          <w:rFonts w:ascii="Calibri" w:cs="Calibri" w:eastAsia="Calibri" w:hAnsi="Calibri"/>
+          <w:color w:val="1F2937"/>
+          <w:sz w:val="19"/>
+          <w:szCs w:val="19"/>
+        </w:rPr>
+        <w:t xml:space="preserve">	</w:t>
+      </w:r>
+      <w:r>
+        <w:rPr>
+          <w:rFonts w:ascii="Calibri" w:cs="Calibri" w:eastAsia="Calibri" w:hAnsi="Calibri"/>
+          <w:b/>
+          <w:bCs/>
+          <w:color w:val="4B5563"/>
+          <w:sz w:val="18"/>
+          <w:szCs w:val="18"/>
+        </w:rPr>
+        <w:t xml:space="preserve">2 months</w:t>
+      </w:r>
+    </w:p>
+    <w:p>
+      <w:pPr>
+        <w:pStyle w:val="ListParagraph"/>
+        <w:numPr>
+          <w:ilvl w:val="0"/>
+          <w:numId w:val="2"/>
+        </w:numPr>
+        <w:spacing w:after="10"/>
+      </w:pPr>
+      <w:r>
+        <w:rPr>
+          <w:rFonts w:ascii="Calibri" w:cs="Calibri" w:eastAsia="Calibri" w:hAnsi="Calibri"/>
+          <w:color w:val="1F2937"/>
+          <w:sz w:val="19"/>
+          <w:szCs w:val="19"/>
+        </w:rPr>
+        <w:t xml:space="preserve">Deployed applications on AWS EC2, managed S3 storage and explored IAM roles.</w:t>
+      </w:r>
+    </w:p>
+    <w:p>
+      <w:pPr>
+        <w:pStyle w:val="ListParagraph"/>
+        <w:numPr>
+          <w:ilvl w:val="0"/>
+          <w:numId w:val="2"/>
+        </w:numPr>
+        <w:spacing w:after="10"/>
+      </w:pPr>
+      <w:r>
+        <w:rPr>
+          <w:rFonts w:ascii="Calibri" w:cs="Calibri" w:eastAsia="Calibri" w:hAnsi="Calibri"/>
+          <w:color w:val="1F2937"/>
+          <w:sz w:val="19"/>
+          <w:szCs w:val="19"/>
+        </w:rPr>
+        <w:t xml:space="preserve">Gained hands-on experience with cloud infrastructure setup and monitoring.</w:t>
+      </w:r>
+    </w:p>
+    <w:p>
+      <w:pPr>
+        <w:keepNext/>
+        <w:tabs>
+          <w:tab w:val="right" w:pos="10326"/>
+        </w:tabs>
+        <w:spacing w:before="80" w:after="0"/>
+      </w:pPr>
+      <w:r>
+        <w:rPr>
+          <w:rFonts w:ascii="Calibri" w:cs="Calibri" w:eastAsia="Calibri" w:hAnsi="Calibri"/>
+          <w:b/>
+          <w:bCs/>
+          <w:color w:val="1F2937"/>
+          <w:sz w:val="19"/>
+          <w:szCs w:val="19"/>
+        </w:rPr>
+        <w:t xml:space="preserve">Data Science &amp; Machine Learning Intern</w:t>
+      </w:r>
+      <w:r>
+        <w:rPr>
+          <w:rFonts w:ascii="Calibri" w:cs="Calibri" w:eastAsia="Calibri" w:hAnsi="Calibri"/>
+          <w:color w:val="4B5563"/>
+          <w:sz w:val="19"/>
+          <w:szCs w:val="19"/>
+        </w:rPr>
+        <w:t xml:space="preserve">  —  APSCHE</w:t>
+      </w:r>
+      <w:r>
+        <w:rPr>
+          <w:rFonts w:ascii="Calibri" w:cs="Calibri" w:eastAsia="Calibri" w:hAnsi="Calibri"/>
+          <w:color w:val="1F2937"/>
+          <w:sz w:val="19"/>
+          <w:szCs w:val="19"/>
+        </w:rPr>
+        <w:t xml:space="preserve">	</w:t>
+      </w:r>
+      <w:r>
+        <w:rPr>
+          <w:rFonts w:ascii="Calibri" w:cs="Calibri" w:eastAsia="Calibri" w:hAnsi="Calibri"/>
+          <w:b/>
+          <w:bCs/>
+          <w:color w:val="4B5563"/>
+          <w:sz w:val="18"/>
+          <w:szCs w:val="18"/>
+        </w:rPr>
+        <w:t xml:space="preserve">6 months</w:t>
+      </w:r>
+    </w:p>
+    <w:p>
+      <w:pPr>
+        <w:pStyle w:val="ListParagraph"/>
+        <w:numPr>
+          <w:ilvl w:val="0"/>
+          <w:numId w:val="2"/>
+        </w:numPr>
+        <w:spacing w:after="10"/>
+      </w:pPr>
+      <w:r>
+        <w:rPr>
+          <w:rFonts w:ascii="Calibri" w:cs="Calibri" w:eastAsia="Calibri" w:hAnsi="Calibri"/>
+          <w:color w:val="1F2937"/>
+          <w:sz w:val="19"/>
+          <w:szCs w:val="19"/>
+        </w:rPr>
+        <w:t xml:space="preserve">Worked on predictive modeling and AI-based solutions for real-world applications.</w:t>
+      </w:r>
+    </w:p>
+    <w:p>
+      <w:pPr>
+        <w:pStyle w:val="ListParagraph"/>
+        <w:numPr>
+          <w:ilvl w:val="0"/>
+          <w:numId w:val="2"/>
+        </w:numPr>
+        <w:spacing w:after="10"/>
+      </w:pPr>
+      <w:r>
+        <w:rPr>
+          <w:rFonts w:ascii="Calibri" w:cs="Calibri" w:eastAsia="Calibri" w:hAnsi="Calibri"/>
+          <w:color w:val="1F2937"/>
+          <w:sz w:val="19"/>
+          <w:szCs w:val="19"/>
+        </w:rPr>
+        <w:t xml:space="preserve">Applied ML algorithms to datasets and improved accuracy through data preprocessing.</w:t>
+      </w:r>
+    </w:p>
+    <w:p>
+      <w:pPr>
+        <w:keepNext/>
+        <w:tabs>
+          <w:tab w:val="right" w:pos="10326"/>
+        </w:tabs>
+        <w:spacing w:before="80" w:after="0"/>
+      </w:pPr>
+      <w:r>
+        <w:rPr>
+          <w:rFonts w:ascii="Calibri" w:cs="Calibri" w:eastAsia="Calibri" w:hAnsi="Calibri"/>
+          <w:b/>
+          <w:bCs/>
+          <w:color w:val="1F2937"/>
+          <w:sz w:val="19"/>
+          <w:szCs w:val="19"/>
+        </w:rPr>
+        <w:t xml:space="preserve">Python Developer Intern</w:t>
+      </w:r>
+      <w:r>
+        <w:rPr>
+          <w:rFonts w:ascii="Calibri" w:cs="Calibri" w:eastAsia="Calibri" w:hAnsi="Calibri"/>
+          <w:color w:val="4B5563"/>
+          <w:sz w:val="19"/>
+          <w:szCs w:val="19"/>
+        </w:rPr>
+        <w:t xml:space="preserve">  —  BrainOVision Solutions</w:t>
+      </w:r>
+      <w:r>
+        <w:rPr>
+          <w:rFonts w:ascii="Calibri" w:cs="Calibri" w:eastAsia="Calibri" w:hAnsi="Calibri"/>
+          <w:color w:val="1F2937"/>
+          <w:sz w:val="19"/>
+          <w:szCs w:val="19"/>
+        </w:rPr>
+        <w:t xml:space="preserve">	</w:t>
+      </w:r>
+      <w:r>
+        <w:rPr>
+          <w:rFonts w:ascii="Calibri" w:cs="Calibri" w:eastAsia="Calibri" w:hAnsi="Calibri"/>
+          <w:b/>
+          <w:bCs/>
+          <w:color w:val="4B5563"/>
+          <w:sz w:val="18"/>
+          <w:szCs w:val="18"/>
+        </w:rPr>
+        <w:t xml:space="preserve">2 months</w:t>
+      </w:r>
+    </w:p>
+    <w:p>
+      <w:pPr>
+        <w:pStyle w:val="ListParagraph"/>
+        <w:numPr>
+          <w:ilvl w:val="0"/>
+          <w:numId w:val="2"/>
+        </w:numPr>
+        <w:spacing w:after="10"/>
+      </w:pPr>
+      <w:r>
+        <w:rPr>
+          <w:rFonts w:ascii="Calibri" w:cs="Calibri" w:eastAsia="Calibri" w:hAnsi="Calibri"/>
+          <w:color w:val="1F2937"/>
+          <w:sz w:val="19"/>
+          <w:szCs w:val="19"/>
+        </w:rPr>
+        <w:t xml:space="preserve">Developed automation scripts and small-scale applications in Python.</w:t>
+      </w:r>
+    </w:p>
+    <w:p>
+      <w:pPr>
+        <w:pStyle w:val="ListParagraph"/>
+        <w:numPr>
+          <w:ilvl w:val="0"/>
+          <w:numId w:val="2"/>
+        </w:numPr>
+        <w:spacing w:after="10"/>
+      </w:pPr>
+      <w:r>
+        <w:rPr>
+          <w:rFonts w:ascii="Calibri" w:cs="Calibri" w:eastAsia="Calibri" w:hAnsi="Calibri"/>
+          <w:color w:val="1F2937"/>
+          <w:sz w:val="19"/>
+          <w:szCs w:val="19"/>
+        </w:rPr>
+        <w:t xml:space="preserve">Improved program efficiency with optimized coding practices.</w:t>
+      </w:r>
+    </w:p>
+    <w:p>
+      <w:pPr>
+        <w:keepNext/>
+        <w:tabs>
+          <w:tab w:val="right" w:pos="10326"/>
+        </w:tabs>
+        <w:spacing w:before="80" w:after="0"/>
+      </w:pPr>
+      <w:r>
+        <w:rPr>
+          <w:rFonts w:ascii="Calibri" w:cs="Calibri" w:eastAsia="Calibri" w:hAnsi="Calibri"/>
+          <w:b/>
+          <w:bCs/>
+          <w:color w:val="1F2937"/>
+          <w:sz w:val="19"/>
+          <w:szCs w:val="19"/>
+        </w:rPr>
+        <w:t xml:space="preserve">Industrial Training</w:t>
+      </w:r>
+      <w:r>
+        <w:rPr>
+          <w:rFonts w:ascii="Calibri" w:cs="Calibri" w:eastAsia="Calibri" w:hAnsi="Calibri"/>
+          <w:color w:val="4B5563"/>
+          <w:sz w:val="19"/>
+          <w:szCs w:val="19"/>
+        </w:rPr>
+        <w:t xml:space="preserve">  —  APSPHC</w:t>
+      </w:r>
+      <w:r>
+        <w:rPr>
+          <w:rFonts w:ascii="Calibri" w:cs="Calibri" w:eastAsia="Calibri" w:hAnsi="Calibri"/>
+          <w:color w:val="1F2937"/>
+          <w:sz w:val="19"/>
+          <w:szCs w:val="19"/>
+        </w:rPr>
+        <w:t xml:space="preserve">	</w:t>
+      </w:r>
+      <w:r>
+        <w:rPr>
+          <w:rFonts w:ascii="Calibri" w:cs="Calibri" w:eastAsia="Calibri" w:hAnsi="Calibri"/>
+          <w:b/>
+          <w:bCs/>
+          <w:color w:val="4B5563"/>
+          <w:sz w:val="18"/>
+          <w:szCs w:val="18"/>
+        </w:rPr>
+        <w:t xml:space="preserve">6 months</w:t>
+      </w:r>
+    </w:p>
+    <w:p>
+      <w:pPr>
+        <w:pStyle w:val="ListParagraph"/>
+        <w:numPr>
+          <w:ilvl w:val="0"/>
+          <w:numId w:val="2"/>
+        </w:numPr>
+        <w:spacing w:after="10"/>
+      </w:pPr>
+      <w:r>
+        <w:rPr>
+          <w:rFonts w:ascii="Calibri" w:cs="Calibri" w:eastAsia="Calibri" w:hAnsi="Calibri"/>
+          <w:color w:val="1F2937"/>
+          <w:sz w:val="19"/>
+          <w:szCs w:val="19"/>
+        </w:rPr>
+        <w:t xml:space="preserve">Gained exposure to infrastructure and technical workflows in public sector projects.</w:t>
       </w:r>
     </w:p>
     <w:p>

</xml_diff>

<commit_message>
Add clickable LinkedIn, GitHub and portfolio logos to resume header; remove location
</commit_message>
<xml_diff>
--- a/Sarathkumar_Resume.docx
+++ b/Sarathkumar_Resume.docx
@@ -63,28 +63,62 @@
           </w:p>
           <w:p>
             <w:pPr>
-              <w:spacing w:after="40"/>
+              <w:spacing w:after="90"/>
             </w:pPr>
-            <w:r>
-              <w:rPr>
-                <w:rFonts w:ascii="Calibri" w:cs="Calibri" w:eastAsia="Calibri" w:hAnsi="Calibri"/>
-                <w:b/>
-                <w:bCs/>
-                <w:color w:val="93A8E8"/>
-                <w:sz w:val="17"/>
-                <w:szCs w:val="17"/>
-              </w:rPr>
-              <w:t xml:space="preserve">EMAIL  </w:t>
-            </w:r>
-            <w:hyperlink w:history="1" r:id="rIdo895wxp2ihqyncj3s0q_p">
+            <w:hyperlink w:history="1" r:id="rIdtsx-tbfijkny_x4ncqglm">
+              <w:r>
+                <w:drawing>
+                  <wp:inline distT="0" distB="0" distL="0" distR="0">
+                    <wp:extent cx="161925" cy="161925"/>
+                    <wp:effectExtent t="0" r="0" b="0" l="0"/>
+                    <wp:docPr id="1" name="" descr="" title="">
+                      <a:hlinkClick xmlns:a="http://schemas.openxmlformats.org/drawingml/2006/main" r:id="rIdtsx-tbfijkny_x4ncqglm"/>
+                    </wp:docPr>
+                    <wp:cNvGraphicFramePr>
+                      <a:graphicFrameLocks xmlns:a="http://schemas.openxmlformats.org/drawingml/2006/main" noChangeAspect="1"/>
+                    </wp:cNvGraphicFramePr>
+                    <a:graphic xmlns:a="http://schemas.openxmlformats.org/drawingml/2006/main">
+                      <a:graphicData uri="http://schemas.openxmlformats.org/drawingml/2006/picture">
+                        <pic:pic xmlns:pic="http://schemas.openxmlformats.org/drawingml/2006/picture">
+                          <pic:nvPicPr>
+                            <pic:cNvPr id="0" name="" descr="">
+                              <a:hlinkClick r:id="rIdtsx-tbfijkny_x4ncqglm"/>
+                            </pic:cNvPr>
+                            <pic:cNvPicPr>
+                              <a:picLocks noChangeAspect="1" noChangeArrowheads="1"/>
+                            </pic:cNvPicPr>
+                          </pic:nvPicPr>
+                          <pic:blipFill>
+                            <a:blip r:embed="rId6" cstate="none"/>
+                            <a:srcRect/>
+                            <a:stretch>
+                              <a:fillRect/>
+                            </a:stretch>
+                          </pic:blipFill>
+                          <pic:spPr bwMode="auto">
+                            <a:xfrm>
+                              <a:off x="0" y="0"/>
+                              <a:ext cx="161925" cy="161925"/>
+                            </a:xfrm>
+                            <a:prstGeom prst="rect">
+                              <a:avLst/>
+                            </a:prstGeom>
+                          </pic:spPr>
+                        </pic:pic>
+                      </a:graphicData>
+                    </a:graphic>
+                  </wp:inline>
+                </w:drawing>
+              </w:r>
               <w:r>
                 <w:rPr>
                   <w:rFonts w:ascii="Calibri" w:cs="Calibri" w:eastAsia="Calibri" w:hAnsi="Calibri"/>
                   <w:color w:val="FFFFFF"/>
-                  <w:sz w:val="18"/>
-                  <w:szCs w:val="18"/>
+                  <w:position w:val="7"/>
+                  <w:sz w:val="19"/>
+                  <w:szCs w:val="19"/>
                 </w:rPr>
-                <w:t xml:space="preserve">dunna.sarathkumar@gmail.com</w:t>
+                <w:t xml:space="preserve">  dunna.sarathkumar@gmail.com</w:t>
               </w:r>
             </w:hyperlink>
             <w:r>
@@ -94,79 +128,114 @@
                 <w:sz w:val="18"/>
                 <w:szCs w:val="18"/>
               </w:rPr>
-              <w:t xml:space="preserve">     </w:t>
+              <w:t xml:space="preserve">        </w:t>
             </w:r>
             <w:r>
-              <w:rPr>
-                <w:rFonts w:ascii="Calibri" w:cs="Calibri" w:eastAsia="Calibri" w:hAnsi="Calibri"/>
-                <w:b/>
-                <w:bCs/>
-                <w:color w:val="93A8E8"/>
-                <w:sz w:val="17"/>
-                <w:szCs w:val="17"/>
-              </w:rPr>
-              <w:t xml:space="preserve">PHONE  </w:t>
+              <w:drawing>
+                <wp:inline distT="0" distB="0" distL="0" distR="0">
+                  <wp:extent cx="161925" cy="161925"/>
+                  <wp:effectExtent t="0" r="0" b="0" l="0"/>
+                  <wp:docPr id="1" name="" descr="" title=""/>
+                  <wp:cNvGraphicFramePr>
+                    <a:graphicFrameLocks xmlns:a="http://schemas.openxmlformats.org/drawingml/2006/main" noChangeAspect="1"/>
+                  </wp:cNvGraphicFramePr>
+                  <a:graphic xmlns:a="http://schemas.openxmlformats.org/drawingml/2006/main">
+                    <a:graphicData uri="http://schemas.openxmlformats.org/drawingml/2006/picture">
+                      <pic:pic xmlns:pic="http://schemas.openxmlformats.org/drawingml/2006/picture">
+                        <pic:nvPicPr>
+                          <pic:cNvPr id="0" name="" descr=""/>
+                          <pic:cNvPicPr>
+                            <a:picLocks noChangeAspect="1" noChangeArrowheads="1"/>
+                          </pic:cNvPicPr>
+                        </pic:nvPicPr>
+                        <pic:blipFill>
+                          <a:blip r:embed="rId7" cstate="none"/>
+                          <a:srcRect/>
+                          <a:stretch>
+                            <a:fillRect/>
+                          </a:stretch>
+                        </pic:blipFill>
+                        <pic:spPr bwMode="auto">
+                          <a:xfrm>
+                            <a:off x="0" y="0"/>
+                            <a:ext cx="161925" cy="161925"/>
+                          </a:xfrm>
+                          <a:prstGeom prst="rect">
+                            <a:avLst/>
+                          </a:prstGeom>
+                        </pic:spPr>
+                      </pic:pic>
+                    </a:graphicData>
+                  </a:graphic>
+                </wp:inline>
+              </w:drawing>
             </w:r>
             <w:r>
               <w:rPr>
                 <w:rFonts w:ascii="Calibri" w:cs="Calibri" w:eastAsia="Calibri" w:hAnsi="Calibri"/>
                 <w:color w:val="FFFFFF"/>
-                <w:sz w:val="18"/>
-                <w:szCs w:val="18"/>
+                <w:position w:val="7"/>
+                <w:sz w:val="19"/>
+                <w:szCs w:val="19"/>
               </w:rPr>
-              <w:t xml:space="preserve">+91 95530 19135</w:t>
-            </w:r>
-            <w:r>
-              <w:rPr>
-                <w:rFonts w:ascii="Calibri" w:cs="Calibri" w:eastAsia="Calibri" w:hAnsi="Calibri"/>
-                <w:color w:val="1F2937"/>
-                <w:sz w:val="18"/>
-                <w:szCs w:val="18"/>
-              </w:rPr>
-              <w:t xml:space="preserve">     </w:t>
-            </w:r>
-            <w:r>
-              <w:rPr>
-                <w:rFonts w:ascii="Calibri" w:cs="Calibri" w:eastAsia="Calibri" w:hAnsi="Calibri"/>
-                <w:b/>
-                <w:bCs/>
-                <w:color w:val="93A8E8"/>
-                <w:sz w:val="17"/>
-                <w:szCs w:val="17"/>
-              </w:rPr>
-              <w:t xml:space="preserve">LOCATION  </w:t>
-            </w:r>
-            <w:r>
-              <w:rPr>
-                <w:rFonts w:ascii="Calibri" w:cs="Calibri" w:eastAsia="Calibri" w:hAnsi="Calibri"/>
-                <w:color w:val="FFFFFF"/>
-                <w:sz w:val="18"/>
-                <w:szCs w:val="18"/>
-              </w:rPr>
-              <w:t xml:space="preserve">Srikakulam, AP · Open to relocate</w:t>
+              <w:t xml:space="preserve">  +91 95530 19135</w:t>
             </w:r>
           </w:p>
           <w:p>
-            <w:r>
-              <w:rPr>
-                <w:rFonts w:ascii="Calibri" w:cs="Calibri" w:eastAsia="Calibri" w:hAnsi="Calibri"/>
-                <w:b/>
-                <w:bCs/>
-                <w:color w:val="93A8E8"/>
-                <w:sz w:val="17"/>
-                <w:szCs w:val="17"/>
-              </w:rPr>
-              <w:t xml:space="preserve">LINKEDIN  </w:t>
-            </w:r>
-            <w:hyperlink w:history="1" r:id="rIdhr2nbouy50fmmpu1vccu-">
+            <w:hyperlink w:history="1" r:id="rIdoe1una9zx25scrab0-jsr">
+              <w:r>
+                <w:drawing>
+                  <wp:inline distT="0" distB="0" distL="0" distR="0">
+                    <wp:extent cx="161925" cy="161925"/>
+                    <wp:effectExtent t="0" r="0" b="0" l="0"/>
+                    <wp:docPr id="1" name="" descr="" title="">
+                      <a:hlinkClick xmlns:a="http://schemas.openxmlformats.org/drawingml/2006/main" r:id="rIdoe1una9zx25scrab0-jsr"/>
+                    </wp:docPr>
+                    <wp:cNvGraphicFramePr>
+                      <a:graphicFrameLocks xmlns:a="http://schemas.openxmlformats.org/drawingml/2006/main" noChangeAspect="1"/>
+                    </wp:cNvGraphicFramePr>
+                    <a:graphic xmlns:a="http://schemas.openxmlformats.org/drawingml/2006/main">
+                      <a:graphicData uri="http://schemas.openxmlformats.org/drawingml/2006/picture">
+                        <pic:pic xmlns:pic="http://schemas.openxmlformats.org/drawingml/2006/picture">
+                          <pic:nvPicPr>
+                            <pic:cNvPr id="0" name="" descr="">
+                              <a:hlinkClick r:id="rIdoe1una9zx25scrab0-jsr"/>
+                            </pic:cNvPr>
+                            <pic:cNvPicPr>
+                              <a:picLocks noChangeAspect="1" noChangeArrowheads="1"/>
+                            </pic:cNvPicPr>
+                          </pic:nvPicPr>
+                          <pic:blipFill>
+                            <a:blip r:embed="rId8" cstate="none"/>
+                            <a:srcRect/>
+                            <a:stretch>
+                              <a:fillRect/>
+                            </a:stretch>
+                          </pic:blipFill>
+                          <pic:spPr bwMode="auto">
+                            <a:xfrm>
+                              <a:off x="0" y="0"/>
+                              <a:ext cx="161925" cy="161925"/>
+                            </a:xfrm>
+                            <a:prstGeom prst="rect">
+                              <a:avLst/>
+                            </a:prstGeom>
+                          </pic:spPr>
+                        </pic:pic>
+                      </a:graphicData>
+                    </a:graphic>
+                  </wp:inline>
+                </w:drawing>
+              </w:r>
               <w:r>
                 <w:rPr>
                   <w:rFonts w:ascii="Calibri" w:cs="Calibri" w:eastAsia="Calibri" w:hAnsi="Calibri"/>
                   <w:color w:val="FFFFFF"/>
-                  <w:sz w:val="18"/>
-                  <w:szCs w:val="18"/>
+                  <w:position w:val="7"/>
+                  <w:sz w:val="19"/>
+                  <w:szCs w:val="19"/>
                 </w:rPr>
-                <w:t xml:space="preserve">sarathkumar-dunnapapagari</w:t>
+                <w:t xml:space="preserve">  LinkedIn</w:t>
               </w:r>
             </w:hyperlink>
             <w:r>
@@ -176,28 +245,62 @@
                 <w:sz w:val="18"/>
                 <w:szCs w:val="18"/>
               </w:rPr>
-              <w:t xml:space="preserve">     </w:t>
+              <w:t xml:space="preserve">        </w:t>
             </w:r>
-            <w:r>
-              <w:rPr>
-                <w:rFonts w:ascii="Calibri" w:cs="Calibri" w:eastAsia="Calibri" w:hAnsi="Calibri"/>
-                <w:b/>
-                <w:bCs/>
-                <w:color w:val="93A8E8"/>
-                <w:sz w:val="17"/>
-                <w:szCs w:val="17"/>
-              </w:rPr>
-              <w:t xml:space="preserve">GITHUB  </w:t>
-            </w:r>
-            <w:hyperlink w:history="1" r:id="rIdewa_wioy1rln8d-90_odp">
+            <w:hyperlink w:history="1" r:id="rIdawzmh9hcs0sd07c_e3za7">
+              <w:r>
+                <w:drawing>
+                  <wp:inline distT="0" distB="0" distL="0" distR="0">
+                    <wp:extent cx="161925" cy="161925"/>
+                    <wp:effectExtent t="0" r="0" b="0" l="0"/>
+                    <wp:docPr id="1" name="" descr="" title="">
+                      <a:hlinkClick xmlns:a="http://schemas.openxmlformats.org/drawingml/2006/main" r:id="rIdawzmh9hcs0sd07c_e3za7"/>
+                    </wp:docPr>
+                    <wp:cNvGraphicFramePr>
+                      <a:graphicFrameLocks xmlns:a="http://schemas.openxmlformats.org/drawingml/2006/main" noChangeAspect="1"/>
+                    </wp:cNvGraphicFramePr>
+                    <a:graphic xmlns:a="http://schemas.openxmlformats.org/drawingml/2006/main">
+                      <a:graphicData uri="http://schemas.openxmlformats.org/drawingml/2006/picture">
+                        <pic:pic xmlns:pic="http://schemas.openxmlformats.org/drawingml/2006/picture">
+                          <pic:nvPicPr>
+                            <pic:cNvPr id="0" name="" descr="">
+                              <a:hlinkClick r:id="rIdawzmh9hcs0sd07c_e3za7"/>
+                            </pic:cNvPr>
+                            <pic:cNvPicPr>
+                              <a:picLocks noChangeAspect="1" noChangeArrowheads="1"/>
+                            </pic:cNvPicPr>
+                          </pic:nvPicPr>
+                          <pic:blipFill>
+                            <a:blip r:embed="rId9" cstate="none"/>
+                            <a:srcRect/>
+                            <a:stretch>
+                              <a:fillRect/>
+                            </a:stretch>
+                          </pic:blipFill>
+                          <pic:spPr bwMode="auto">
+                            <a:xfrm>
+                              <a:off x="0" y="0"/>
+                              <a:ext cx="161925" cy="161925"/>
+                            </a:xfrm>
+                            <a:prstGeom prst="rect">
+                              <a:avLst/>
+                            </a:prstGeom>
+                          </pic:spPr>
+                        </pic:pic>
+                      </a:graphicData>
+                    </a:graphic>
+                  </wp:inline>
+                </w:drawing>
+              </w:r>
               <w:r>
                 <w:rPr>
                   <w:rFonts w:ascii="Calibri" w:cs="Calibri" w:eastAsia="Calibri" w:hAnsi="Calibri"/>
                   <w:color w:val="FFFFFF"/>
-                  <w:sz w:val="18"/>
-                  <w:szCs w:val="18"/>
+                  <w:position w:val="7"/>
+                  <w:sz w:val="19"/>
+                  <w:szCs w:val="19"/>
                 </w:rPr>
-                <w:t xml:space="preserve">sarathdunna</w:t>
+                <w:t xml:space="preserve">  GitHub</w:t>
               </w:r>
             </w:hyperlink>
             <w:r>
@@ -207,28 +310,62 @@
                 <w:sz w:val="18"/>
                 <w:szCs w:val="18"/>
               </w:rPr>
-              <w:t xml:space="preserve">     </w:t>
+              <w:t xml:space="preserve">        </w:t>
             </w:r>
-            <w:r>
-              <w:rPr>
-                <w:rFonts w:ascii="Calibri" w:cs="Calibri" w:eastAsia="Calibri" w:hAnsi="Calibri"/>
-                <w:b/>
-                <w:bCs/>
-                <w:color w:val="93A8E8"/>
-                <w:sz w:val="17"/>
-                <w:szCs w:val="17"/>
-              </w:rPr>
-              <w:t xml:space="preserve">PORTFOLIO  </w:t>
-            </w:r>
-            <w:hyperlink w:history="1" r:id="rIdbvf8trjlqluhijgm5sp6b">
+            <w:hyperlink w:history="1" r:id="rIdnmoontrgnu9tvyugmd9ak">
+              <w:r>
+                <w:drawing>
+                  <wp:inline distT="0" distB="0" distL="0" distR="0">
+                    <wp:extent cx="161925" cy="161925"/>
+                    <wp:effectExtent t="0" r="0" b="0" l="0"/>
+                    <wp:docPr id="1" name="" descr="" title="">
+                      <a:hlinkClick xmlns:a="http://schemas.openxmlformats.org/drawingml/2006/main" r:id="rIdnmoontrgnu9tvyugmd9ak"/>
+                    </wp:docPr>
+                    <wp:cNvGraphicFramePr>
+                      <a:graphicFrameLocks xmlns:a="http://schemas.openxmlformats.org/drawingml/2006/main" noChangeAspect="1"/>
+                    </wp:cNvGraphicFramePr>
+                    <a:graphic xmlns:a="http://schemas.openxmlformats.org/drawingml/2006/main">
+                      <a:graphicData uri="http://schemas.openxmlformats.org/drawingml/2006/picture">
+                        <pic:pic xmlns:pic="http://schemas.openxmlformats.org/drawingml/2006/picture">
+                          <pic:nvPicPr>
+                            <pic:cNvPr id="0" name="" descr="">
+                              <a:hlinkClick r:id="rIdnmoontrgnu9tvyugmd9ak"/>
+                            </pic:cNvPr>
+                            <pic:cNvPicPr>
+                              <a:picLocks noChangeAspect="1" noChangeArrowheads="1"/>
+                            </pic:cNvPicPr>
+                          </pic:nvPicPr>
+                          <pic:blipFill>
+                            <a:blip r:embed="rId10" cstate="none"/>
+                            <a:srcRect/>
+                            <a:stretch>
+                              <a:fillRect/>
+                            </a:stretch>
+                          </pic:blipFill>
+                          <pic:spPr bwMode="auto">
+                            <a:xfrm>
+                              <a:off x="0" y="0"/>
+                              <a:ext cx="161925" cy="161925"/>
+                            </a:xfrm>
+                            <a:prstGeom prst="rect">
+                              <a:avLst/>
+                            </a:prstGeom>
+                          </pic:spPr>
+                        </pic:pic>
+                      </a:graphicData>
+                    </a:graphic>
+                  </wp:inline>
+                </w:drawing>
+              </w:r>
               <w:r>
                 <w:rPr>
                   <w:rFonts w:ascii="Calibri" w:cs="Calibri" w:eastAsia="Calibri" w:hAnsi="Calibri"/>
                   <w:color w:val="FFFFFF"/>
-                  <w:sz w:val="18"/>
-                  <w:szCs w:val="18"/>
+                  <w:position w:val="7"/>
+                  <w:sz w:val="19"/>
+                  <w:szCs w:val="19"/>
                 </w:rPr>
-                <w:t xml:space="preserve">sarathdunna.github.io/myportfolio</w:t>
+                <w:t xml:space="preserve">  Portfolio</w:t>
               </w:r>
             </w:hyperlink>
           </w:p>
@@ -943,7 +1080,7 @@
         </w:rPr>
         <w:t xml:space="preserve">    </w:t>
       </w:r>
-      <w:hyperlink w:history="1" r:id="rIdhk4cxfuq5e9wvemmutfey">
+      <w:hyperlink w:history="1" r:id="rIdydm7j_lgfjz6syihfdsy6">
         <w:r>
           <w:rPr>
             <w:rFonts w:ascii="Calibri" w:cs="Calibri" w:eastAsia="Calibri" w:hAnsi="Calibri"/>
@@ -963,7 +1100,7 @@
         </w:rPr>
         <w:t xml:space="preserve">  ·  </w:t>
       </w:r>
-      <w:hyperlink w:history="1" r:id="rIdq5ft0vben1r_jdmsagd3h">
+      <w:hyperlink w:history="1" r:id="rIdqo1_is3y--wumk983lg-d">
         <w:r>
           <w:rPr>
             <w:rFonts w:ascii="Calibri" w:cs="Calibri" w:eastAsia="Calibri" w:hAnsi="Calibri"/>
@@ -1106,7 +1243,7 @@
         </w:rPr>
         <w:t xml:space="preserve">    </w:t>
       </w:r>
-      <w:hyperlink w:history="1" r:id="rIdqizh_k3-9ll_d5tq3x4qt">
+      <w:hyperlink w:history="1" r:id="rIdsxzumu3ufrewa2qtdknru">
         <w:r>
           <w:rPr>
             <w:rFonts w:ascii="Calibri" w:cs="Calibri" w:eastAsia="Calibri" w:hAnsi="Calibri"/>
@@ -1230,7 +1367,7 @@
         </w:rPr>
         <w:t xml:space="preserve">    </w:t>
       </w:r>
-      <w:hyperlink w:history="1" r:id="rIdjcovgdm0kuzmhhei-lhbu">
+      <w:hyperlink w:history="1" r:id="rId4b9ptnkgqvlfbclttl0qr">
         <w:r>
           <w:rPr>
             <w:rFonts w:ascii="Calibri" w:cs="Calibri" w:eastAsia="Calibri" w:hAnsi="Calibri"/>

</xml_diff>

<commit_message>
Show profile URLs, add target line and project metrics; add ATS-friendly resume
</commit_message>
<xml_diff>
--- a/Sarathkumar_Resume.docx
+++ b/Sarathkumar_Resume.docx
@@ -58,21 +58,21 @@
                 <w:sz w:val="21"/>
                 <w:szCs w:val="21"/>
               </w:rPr>
-              <w:t xml:space="preserve">M.Tech CSE Student  ·  B.Tech IT Graduate  ·  Fresher</w:t>
+              <w:t xml:space="preserve">Aspiring Cloud &amp; ML Engineer  ·  M.Tech CSE Student  ·  B.Tech IT Graduate</w:t>
             </w:r>
           </w:p>
           <w:p>
             <w:pPr>
               <w:spacing w:after="90"/>
             </w:pPr>
-            <w:hyperlink w:history="1" r:id="rIdtsx-tbfijkny_x4ncqglm">
+            <w:hyperlink w:history="1" r:id="rIddavnlebmrczvq6dxqbthw">
               <w:r>
                 <w:drawing>
                   <wp:inline distT="0" distB="0" distL="0" distR="0">
                     <wp:extent cx="161925" cy="161925"/>
                     <wp:effectExtent t="0" r="0" b="0" l="0"/>
                     <wp:docPr id="1" name="" descr="" title="">
-                      <a:hlinkClick xmlns:a="http://schemas.openxmlformats.org/drawingml/2006/main" r:id="rIdtsx-tbfijkny_x4ncqglm"/>
+                      <a:hlinkClick xmlns:a="http://schemas.openxmlformats.org/drawingml/2006/main" r:id="rIddavnlebmrczvq6dxqbthw"/>
                     </wp:docPr>
                     <wp:cNvGraphicFramePr>
                       <a:graphicFrameLocks xmlns:a="http://schemas.openxmlformats.org/drawingml/2006/main" noChangeAspect="1"/>
@@ -82,7 +82,7 @@
                         <pic:pic xmlns:pic="http://schemas.openxmlformats.org/drawingml/2006/picture">
                           <pic:nvPicPr>
                             <pic:cNvPr id="0" name="" descr="">
-                              <a:hlinkClick r:id="rIdtsx-tbfijkny_x4ncqglm"/>
+                              <a:hlinkClick r:id="rIddavnlebmrczvq6dxqbthw"/>
                             </pic:cNvPr>
                             <pic:cNvPicPr>
                               <a:picLocks noChangeAspect="1" noChangeArrowheads="1"/>
@@ -115,8 +115,8 @@
                   <w:rFonts w:ascii="Calibri" w:cs="Calibri" w:eastAsia="Calibri" w:hAnsi="Calibri"/>
                   <w:color w:val="FFFFFF"/>
                   <w:position w:val="7"/>
-                  <w:sz w:val="19"/>
-                  <w:szCs w:val="19"/>
+                  <w:sz w:val="18"/>
+                  <w:szCs w:val="18"/>
                 </w:rPr>
                 <w:t xml:space="preserve">  dunna.sarathkumar@gmail.com</w:t>
               </w:r>
@@ -128,7 +128,7 @@
                 <w:sz w:val="18"/>
                 <w:szCs w:val="18"/>
               </w:rPr>
-              <w:t xml:space="preserve">        </w:t>
+              <w:t xml:space="preserve">      </w:t>
             </w:r>
             <w:r>
               <w:drawing>
@@ -175,21 +175,28 @@
                 <w:rFonts w:ascii="Calibri" w:cs="Calibri" w:eastAsia="Calibri" w:hAnsi="Calibri"/>
                 <w:color w:val="FFFFFF"/>
                 <w:position w:val="7"/>
-                <w:sz w:val="19"/>
-                <w:szCs w:val="19"/>
+                <w:sz w:val="18"/>
+                <w:szCs w:val="18"/>
               </w:rPr>
               <w:t xml:space="preserve">  +91 95530 19135</w:t>
             </w:r>
-          </w:p>
-          <w:p>
-            <w:hyperlink w:history="1" r:id="rIdoe1una9zx25scrab0-jsr">
+            <w:r>
+              <w:rPr>
+                <w:rFonts w:ascii="Calibri" w:cs="Calibri" w:eastAsia="Calibri" w:hAnsi="Calibri"/>
+                <w:color w:val="1F2937"/>
+                <w:sz w:val="18"/>
+                <w:szCs w:val="18"/>
+              </w:rPr>
+              <w:t xml:space="preserve">      </w:t>
+            </w:r>
+            <w:hyperlink w:history="1" r:id="rIdb_nhz7mqxnq4yuo_qqe0b">
               <w:r>
                 <w:drawing>
                   <wp:inline distT="0" distB="0" distL="0" distR="0">
                     <wp:extent cx="161925" cy="161925"/>
                     <wp:effectExtent t="0" r="0" b="0" l="0"/>
                     <wp:docPr id="1" name="" descr="" title="">
-                      <a:hlinkClick xmlns:a="http://schemas.openxmlformats.org/drawingml/2006/main" r:id="rIdoe1una9zx25scrab0-jsr"/>
+                      <a:hlinkClick xmlns:a="http://schemas.openxmlformats.org/drawingml/2006/main" r:id="rIdb_nhz7mqxnq4yuo_qqe0b"/>
                     </wp:docPr>
                     <wp:cNvGraphicFramePr>
                       <a:graphicFrameLocks xmlns:a="http://schemas.openxmlformats.org/drawingml/2006/main" noChangeAspect="1"/>
@@ -199,7 +206,7 @@
                         <pic:pic xmlns:pic="http://schemas.openxmlformats.org/drawingml/2006/picture">
                           <pic:nvPicPr>
                             <pic:cNvPr id="0" name="" descr="">
-                              <a:hlinkClick r:id="rIdoe1una9zx25scrab0-jsr"/>
+                              <a:hlinkClick r:id="rIdb_nhz7mqxnq4yuo_qqe0b"/>
                             </pic:cNvPr>
                             <pic:cNvPicPr>
                               <a:picLocks noChangeAspect="1" noChangeArrowheads="1"/>
@@ -232,29 +239,22 @@
                   <w:rFonts w:ascii="Calibri" w:cs="Calibri" w:eastAsia="Calibri" w:hAnsi="Calibri"/>
                   <w:color w:val="FFFFFF"/>
                   <w:position w:val="7"/>
-                  <w:sz w:val="19"/>
-                  <w:szCs w:val="19"/>
+                  <w:sz w:val="18"/>
+                  <w:szCs w:val="18"/>
                 </w:rPr>
-                <w:t xml:space="preserve">  LinkedIn</w:t>
+                <w:t xml:space="preserve">  github.com/sarathdunna</w:t>
               </w:r>
             </w:hyperlink>
-            <w:r>
-              <w:rPr>
-                <w:rFonts w:ascii="Calibri" w:cs="Calibri" w:eastAsia="Calibri" w:hAnsi="Calibri"/>
-                <w:color w:val="1F2937"/>
-                <w:sz w:val="18"/>
-                <w:szCs w:val="18"/>
-              </w:rPr>
-              <w:t xml:space="preserve">        </w:t>
-            </w:r>
-            <w:hyperlink w:history="1" r:id="rIdawzmh9hcs0sd07c_e3za7">
+          </w:p>
+          <w:p>
+            <w:hyperlink w:history="1" r:id="rIdftyxewp33kjymvuifdydc">
               <w:r>
                 <w:drawing>
                   <wp:inline distT="0" distB="0" distL="0" distR="0">
                     <wp:extent cx="161925" cy="161925"/>
                     <wp:effectExtent t="0" r="0" b="0" l="0"/>
                     <wp:docPr id="1" name="" descr="" title="">
-                      <a:hlinkClick xmlns:a="http://schemas.openxmlformats.org/drawingml/2006/main" r:id="rIdawzmh9hcs0sd07c_e3za7"/>
+                      <a:hlinkClick xmlns:a="http://schemas.openxmlformats.org/drawingml/2006/main" r:id="rIdftyxewp33kjymvuifdydc"/>
                     </wp:docPr>
                     <wp:cNvGraphicFramePr>
                       <a:graphicFrameLocks xmlns:a="http://schemas.openxmlformats.org/drawingml/2006/main" noChangeAspect="1"/>
@@ -264,7 +264,7 @@
                         <pic:pic xmlns:pic="http://schemas.openxmlformats.org/drawingml/2006/picture">
                           <pic:nvPicPr>
                             <pic:cNvPr id="0" name="" descr="">
-                              <a:hlinkClick r:id="rIdawzmh9hcs0sd07c_e3za7"/>
+                              <a:hlinkClick r:id="rIdftyxewp33kjymvuifdydc"/>
                             </pic:cNvPr>
                             <pic:cNvPicPr>
                               <a:picLocks noChangeAspect="1" noChangeArrowheads="1"/>
@@ -297,10 +297,10 @@
                   <w:rFonts w:ascii="Calibri" w:cs="Calibri" w:eastAsia="Calibri" w:hAnsi="Calibri"/>
                   <w:color w:val="FFFFFF"/>
                   <w:position w:val="7"/>
-                  <w:sz w:val="19"/>
-                  <w:szCs w:val="19"/>
+                  <w:sz w:val="18"/>
+                  <w:szCs w:val="18"/>
                 </w:rPr>
-                <w:t xml:space="preserve">  GitHub</w:t>
+                <w:t xml:space="preserve">  linkedin.com/in/sarathkumar-dunnapapagari</w:t>
               </w:r>
             </w:hyperlink>
             <w:r>
@@ -310,16 +310,16 @@
                 <w:sz w:val="18"/>
                 <w:szCs w:val="18"/>
               </w:rPr>
-              <w:t xml:space="preserve">        </w:t>
+              <w:t xml:space="preserve">      </w:t>
             </w:r>
-            <w:hyperlink w:history="1" r:id="rIdnmoontrgnu9tvyugmd9ak">
+            <w:hyperlink w:history="1" r:id="rId-cq7ovcuewyizusj6p3w0">
               <w:r>
                 <w:drawing>
                   <wp:inline distT="0" distB="0" distL="0" distR="0">
                     <wp:extent cx="161925" cy="161925"/>
                     <wp:effectExtent t="0" r="0" b="0" l="0"/>
                     <wp:docPr id="1" name="" descr="" title="">
-                      <a:hlinkClick xmlns:a="http://schemas.openxmlformats.org/drawingml/2006/main" r:id="rIdnmoontrgnu9tvyugmd9ak"/>
+                      <a:hlinkClick xmlns:a="http://schemas.openxmlformats.org/drawingml/2006/main" r:id="rId-cq7ovcuewyizusj6p3w0"/>
                     </wp:docPr>
                     <wp:cNvGraphicFramePr>
                       <a:graphicFrameLocks xmlns:a="http://schemas.openxmlformats.org/drawingml/2006/main" noChangeAspect="1"/>
@@ -329,7 +329,7 @@
                         <pic:pic xmlns:pic="http://schemas.openxmlformats.org/drawingml/2006/picture">
                           <pic:nvPicPr>
                             <pic:cNvPr id="0" name="" descr="">
-                              <a:hlinkClick r:id="rIdnmoontrgnu9tvyugmd9ak"/>
+                              <a:hlinkClick r:id="rId-cq7ovcuewyizusj6p3w0"/>
                             </pic:cNvPr>
                             <pic:cNvPicPr>
                               <a:picLocks noChangeAspect="1" noChangeArrowheads="1"/>
@@ -362,10 +362,10 @@
                   <w:rFonts w:ascii="Calibri" w:cs="Calibri" w:eastAsia="Calibri" w:hAnsi="Calibri"/>
                   <w:color w:val="FFFFFF"/>
                   <w:position w:val="7"/>
-                  <w:sz w:val="19"/>
-                  <w:szCs w:val="19"/>
+                  <w:sz w:val="18"/>
+                  <w:szCs w:val="18"/>
                 </w:rPr>
-                <w:t xml:space="preserve">  Portfolio</w:t>
+                <w:t xml:space="preserve">  sarathdunna.github.io/myportfolio</w:t>
               </w:r>
             </w:hyperlink>
           </w:p>
@@ -1080,7 +1080,7 @@
         </w:rPr>
         <w:t xml:space="preserve">    </w:t>
       </w:r>
-      <w:hyperlink w:history="1" r:id="rIdydm7j_lgfjz6syihfdsy6">
+      <w:hyperlink w:history="1" r:id="rIddj3f3f4mqadriss06y5ca">
         <w:r>
           <w:rPr>
             <w:rFonts w:ascii="Calibri" w:cs="Calibri" w:eastAsia="Calibri" w:hAnsi="Calibri"/>
@@ -1100,7 +1100,7 @@
         </w:rPr>
         <w:t xml:space="preserve">  ·  </w:t>
       </w:r>
-      <w:hyperlink w:history="1" r:id="rIdqo1_is3y--wumk983lg-d">
+      <w:hyperlink w:history="1" r:id="rIdnu977vbi_ku2wtd84zvpj">
         <w:r>
           <w:rPr>
             <w:rFonts w:ascii="Calibri" w:cs="Calibri" w:eastAsia="Calibri" w:hAnsi="Calibri"/>
@@ -1243,7 +1243,7 @@
         </w:rPr>
         <w:t xml:space="preserve">    </w:t>
       </w:r>
-      <w:hyperlink w:history="1" r:id="rIdsxzumu3ufrewa2qtdknru">
+      <w:hyperlink w:history="1" r:id="rIdyofqqokndxxlypxayiyi0">
         <w:r>
           <w:rPr>
             <w:rFonts w:ascii="Calibri" w:cs="Calibri" w:eastAsia="Calibri" w:hAnsi="Calibri"/>
@@ -1291,7 +1291,7 @@
           <w:sz w:val="19"/>
           <w:szCs w:val="19"/>
         </w:rPr>
-        <w:t xml:space="preserve">Developed an AI-assisted data analysis platform: explore datasets with charts, plain-English questions or SQL, then train and compare ML models.</w:t>
+        <w:t xml:space="preserve">Developed an AI-assisted data analysis platform: explore datasets with charts, plain-English questions or SQL, then train and compare 11 ML algorithms (5 classification, 6 regression).</w:t>
       </w:r>
     </w:p>
     <w:p>
@@ -1310,7 +1310,7 @@
           <w:sz w:val="19"/>
           <w:szCs w:val="19"/>
         </w:rPr>
-        <w:t xml:space="preserve">Added PDF reports and optional LLM explanations on code-computed results; works fully without an API key.</w:t>
+        <w:t xml:space="preserve">Added explainability, PDF reports, optional LLM explanations and 14 automated backend tests; works fully without an API key.</w:t>
       </w:r>
     </w:p>
     <w:p>
@@ -1367,7 +1367,7 @@
         </w:rPr>
         <w:t xml:space="preserve">    </w:t>
       </w:r>
-      <w:hyperlink w:history="1" r:id="rId4b9ptnkgqvlfbclttl0qr">
+      <w:hyperlink w:history="1" r:id="rId7hionrceqhe67ibgq2grk">
         <w:r>
           <w:rPr>
             <w:rFonts w:ascii="Calibri" w:cs="Calibri" w:eastAsia="Calibri" w:hAnsi="Calibri"/>
@@ -1434,7 +1434,7 @@
           <w:sz w:val="19"/>
           <w:szCs w:val="19"/>
         </w:rPr>
-        <w:t xml:space="preserve">Fine-tuned a transfer-learned CNN on FER-2013 and smoothed predictions so the mood and playlist stay stable.</w:t>
+        <w:t xml:space="preserve">Fine-tuned an EfficientNet-B0 classifier on FER-2013 for 7 emotions, benchmarked it against a baseline CNN, and smoothed predictions to keep the playlist stable.</w:t>
       </w:r>
     </w:p>
     <w:p>

</xml_diff>

<commit_message>
Add internship dates, M.Tech CGPA, SSC, verified certifications and achievements
</commit_message>
<xml_diff>
--- a/Sarathkumar_Resume.docx
+++ b/Sarathkumar_Resume.docx
@@ -65,14 +65,14 @@
             <w:pPr>
               <w:spacing w:after="90"/>
             </w:pPr>
-            <w:hyperlink w:history="1" r:id="rIddavnlebmrczvq6dxqbthw">
+            <w:hyperlink w:history="1" r:id="rId_grdnp3sjlae6lqydvtde">
               <w:r>
                 <w:drawing>
                   <wp:inline distT="0" distB="0" distL="0" distR="0">
                     <wp:extent cx="161925" cy="161925"/>
                     <wp:effectExtent t="0" r="0" b="0" l="0"/>
                     <wp:docPr id="1" name="" descr="" title="">
-                      <a:hlinkClick xmlns:a="http://schemas.openxmlformats.org/drawingml/2006/main" r:id="rIddavnlebmrczvq6dxqbthw"/>
+                      <a:hlinkClick xmlns:a="http://schemas.openxmlformats.org/drawingml/2006/main" r:id="rId_grdnp3sjlae6lqydvtde"/>
                     </wp:docPr>
                     <wp:cNvGraphicFramePr>
                       <a:graphicFrameLocks xmlns:a="http://schemas.openxmlformats.org/drawingml/2006/main" noChangeAspect="1"/>
@@ -82,7 +82,7 @@
                         <pic:pic xmlns:pic="http://schemas.openxmlformats.org/drawingml/2006/picture">
                           <pic:nvPicPr>
                             <pic:cNvPr id="0" name="" descr="">
-                              <a:hlinkClick r:id="rIddavnlebmrczvq6dxqbthw"/>
+                              <a:hlinkClick r:id="rId_grdnp3sjlae6lqydvtde"/>
                             </pic:cNvPr>
                             <pic:cNvPicPr>
                               <a:picLocks noChangeAspect="1" noChangeArrowheads="1"/>
@@ -189,14 +189,14 @@
               </w:rPr>
               <w:t xml:space="preserve">      </w:t>
             </w:r>
-            <w:hyperlink w:history="1" r:id="rIdb_nhz7mqxnq4yuo_qqe0b">
+            <w:hyperlink w:history="1" r:id="rIdfjrqtfkwt4vpwz190e_ix">
               <w:r>
                 <w:drawing>
                   <wp:inline distT="0" distB="0" distL="0" distR="0">
                     <wp:extent cx="161925" cy="161925"/>
                     <wp:effectExtent t="0" r="0" b="0" l="0"/>
                     <wp:docPr id="1" name="" descr="" title="">
-                      <a:hlinkClick xmlns:a="http://schemas.openxmlformats.org/drawingml/2006/main" r:id="rIdb_nhz7mqxnq4yuo_qqe0b"/>
+                      <a:hlinkClick xmlns:a="http://schemas.openxmlformats.org/drawingml/2006/main" r:id="rIdfjrqtfkwt4vpwz190e_ix"/>
                     </wp:docPr>
                     <wp:cNvGraphicFramePr>
                       <a:graphicFrameLocks xmlns:a="http://schemas.openxmlformats.org/drawingml/2006/main" noChangeAspect="1"/>
@@ -206,7 +206,7 @@
                         <pic:pic xmlns:pic="http://schemas.openxmlformats.org/drawingml/2006/picture">
                           <pic:nvPicPr>
                             <pic:cNvPr id="0" name="" descr="">
-                              <a:hlinkClick r:id="rIdb_nhz7mqxnq4yuo_qqe0b"/>
+                              <a:hlinkClick r:id="rIdfjrqtfkwt4vpwz190e_ix"/>
                             </pic:cNvPr>
                             <pic:cNvPicPr>
                               <a:picLocks noChangeAspect="1" noChangeArrowheads="1"/>
@@ -247,14 +247,14 @@
             </w:hyperlink>
           </w:p>
           <w:p>
-            <w:hyperlink w:history="1" r:id="rIdftyxewp33kjymvuifdydc">
+            <w:hyperlink w:history="1" r:id="rId0d39caclb_rijf9lvlv0f">
               <w:r>
                 <w:drawing>
                   <wp:inline distT="0" distB="0" distL="0" distR="0">
                     <wp:extent cx="161925" cy="161925"/>
                     <wp:effectExtent t="0" r="0" b="0" l="0"/>
                     <wp:docPr id="1" name="" descr="" title="">
-                      <a:hlinkClick xmlns:a="http://schemas.openxmlformats.org/drawingml/2006/main" r:id="rIdftyxewp33kjymvuifdydc"/>
+                      <a:hlinkClick xmlns:a="http://schemas.openxmlformats.org/drawingml/2006/main" r:id="rId0d39caclb_rijf9lvlv0f"/>
                     </wp:docPr>
                     <wp:cNvGraphicFramePr>
                       <a:graphicFrameLocks xmlns:a="http://schemas.openxmlformats.org/drawingml/2006/main" noChangeAspect="1"/>
@@ -264,7 +264,7 @@
                         <pic:pic xmlns:pic="http://schemas.openxmlformats.org/drawingml/2006/picture">
                           <pic:nvPicPr>
                             <pic:cNvPr id="0" name="" descr="">
-                              <a:hlinkClick r:id="rIdftyxewp33kjymvuifdydc"/>
+                              <a:hlinkClick r:id="rId0d39caclb_rijf9lvlv0f"/>
                             </pic:cNvPr>
                             <pic:cNvPicPr>
                               <a:picLocks noChangeAspect="1" noChangeArrowheads="1"/>
@@ -312,14 +312,14 @@
               </w:rPr>
               <w:t xml:space="preserve">      </w:t>
             </w:r>
-            <w:hyperlink w:history="1" r:id="rId-cq7ovcuewyizusj6p3w0">
+            <w:hyperlink w:history="1" r:id="rId2dhkfeibz8l1kt0eedi5x">
               <w:r>
                 <w:drawing>
                   <wp:inline distT="0" distB="0" distL="0" distR="0">
                     <wp:extent cx="161925" cy="161925"/>
                     <wp:effectExtent t="0" r="0" b="0" l="0"/>
                     <wp:docPr id="1" name="" descr="" title="">
-                      <a:hlinkClick xmlns:a="http://schemas.openxmlformats.org/drawingml/2006/main" r:id="rId-cq7ovcuewyizusj6p3w0"/>
+                      <a:hlinkClick xmlns:a="http://schemas.openxmlformats.org/drawingml/2006/main" r:id="rId2dhkfeibz8l1kt0eedi5x"/>
                     </wp:docPr>
                     <wp:cNvGraphicFramePr>
                       <a:graphicFrameLocks xmlns:a="http://schemas.openxmlformats.org/drawingml/2006/main" noChangeAspect="1"/>
@@ -329,7 +329,7 @@
                         <pic:pic xmlns:pic="http://schemas.openxmlformats.org/drawingml/2006/picture">
                           <pic:nvPicPr>
                             <pic:cNvPr id="0" name="" descr="">
-                              <a:hlinkClick r:id="rId-cq7ovcuewyizusj6p3w0"/>
+                              <a:hlinkClick r:id="rId2dhkfeibz8l1kt0eedi5x"/>
                             </pic:cNvPr>
                             <pic:cNvPicPr>
                               <a:picLocks noChangeAspect="1" noChangeArrowheads="1"/>
@@ -414,7 +414,7 @@
           <w:sz w:val="19"/>
           <w:szCs w:val="19"/>
         </w:rPr>
-        <w:t xml:space="preserve">Motivated M.Tech Computer Science student and B.Tech IT graduate with four internships and trainings in AWS cloud, Python development and data science / machine learning. Hands-on experience building real-time computer vision, machine learning and full-stack projects with Python, PyTorch, YOLOv8, FastAPI and React, and deploying on AWS and GCP. Eager to start my career in a full-time role where I can learn fast and build reliable, scalable solutions.</w:t>
+        <w:t xml:space="preserve">M.Tech Computer Science student (CGPA 8.3) and B.Tech IT graduate with four internships in AWS cloud, Python and data science / ML. Built real-time computer vision, machine learning and full-stack projects with Python, PyTorch, YOLOv8, FastAPI and React. Eager to start my career in a full-time role and build reliable, scalable solutions.</w:t>
       </w:r>
     </w:p>
     <w:p>
@@ -1080,7 +1080,7 @@
         </w:rPr>
         <w:t xml:space="preserve">    </w:t>
       </w:r>
-      <w:hyperlink w:history="1" r:id="rIddj3f3f4mqadriss06y5ca">
+      <w:hyperlink w:history="1" r:id="rIdlwcxa9f89v3tsong53ff7">
         <w:r>
           <w:rPr>
             <w:rFonts w:ascii="Calibri" w:cs="Calibri" w:eastAsia="Calibri" w:hAnsi="Calibri"/>
@@ -1100,7 +1100,7 @@
         </w:rPr>
         <w:t xml:space="preserve">  ·  </w:t>
       </w:r>
-      <w:hyperlink w:history="1" r:id="rIdnu977vbi_ku2wtd84zvpj">
+      <w:hyperlink w:history="1" r:id="rIditpcahivsarmcebu45hij">
         <w:r>
           <w:rPr>
             <w:rFonts w:ascii="Calibri" w:cs="Calibri" w:eastAsia="Calibri" w:hAnsi="Calibri"/>
@@ -1243,7 +1243,7 @@
         </w:rPr>
         <w:t xml:space="preserve">    </w:t>
       </w:r>
-      <w:hyperlink w:history="1" r:id="rIdyofqqokndxxlypxayiyi0">
+      <w:hyperlink w:history="1" r:id="rIdiomomqfenosp4ggkx08qu">
         <w:r>
           <w:rPr>
             <w:rFonts w:ascii="Calibri" w:cs="Calibri" w:eastAsia="Calibri" w:hAnsi="Calibri"/>
@@ -1291,7 +1291,7 @@
           <w:sz w:val="19"/>
           <w:szCs w:val="19"/>
         </w:rPr>
-        <w:t xml:space="preserve">Developed an AI-assisted data analysis platform: explore datasets with charts, plain-English questions or SQL, then train and compare 11 ML algorithms (5 classification, 6 regression).</w:t>
+        <w:t xml:space="preserve">Built an AI-assisted analysis platform: charts, plain-English or SQL queries, and 11 ML algorithms (5 classification, 6 regression).</w:t>
       </w:r>
     </w:p>
     <w:p>
@@ -1367,7 +1367,7 @@
         </w:rPr>
         <w:t xml:space="preserve">    </w:t>
       </w:r>
-      <w:hyperlink w:history="1" r:id="rId7hionrceqhe67ibgq2grk">
+      <w:hyperlink w:history="1" r:id="rIdoa1hkexhedzg5lf5_mzzn">
         <w:r>
           <w:rPr>
             <w:rFonts w:ascii="Calibri" w:cs="Calibri" w:eastAsia="Calibri" w:hAnsi="Calibri"/>
@@ -1434,7 +1434,7 @@
           <w:sz w:val="19"/>
           <w:szCs w:val="19"/>
         </w:rPr>
-        <w:t xml:space="preserve">Fine-tuned an EfficientNet-B0 classifier on FER-2013 for 7 emotions, benchmarked it against a baseline CNN, and smoothed predictions to keep the playlist stable.</w:t>
+        <w:t xml:space="preserve">Fine-tuned EfficientNet-B0 on FER-2013 for 7 emotions, benchmarked against a baseline CNN, with smoothed predictions.</w:t>
       </w:r>
     </w:p>
     <w:p>
@@ -1524,13 +1524,13 @@
       <w:r>
         <w:rPr>
           <w:rFonts w:ascii="Calibri" w:cs="Calibri" w:eastAsia="Calibri" w:hAnsi="Calibri"/>
-          <w:i/>
-          <w:iCs/>
+          <w:b/>
+          <w:bCs/>
           <w:color w:val="2563EB"/>
           <w:sz w:val="19"/>
           <w:szCs w:val="19"/>
         </w:rPr>
-        <w:t xml:space="preserve">   Pursuing</w:t>
+        <w:t xml:space="preserve">   CGPA 8.3 (till Sem 2)</w:t>
       </w:r>
       <w:r>
         <w:rPr>
@@ -1676,6 +1676,66 @@
     <w:p>
       <w:pPr>
         <w:keepNext/>
+        <w:tabs>
+          <w:tab w:val="right" w:pos="10466"/>
+        </w:tabs>
+        <w:spacing w:before="50" w:after="10"/>
+      </w:pPr>
+      <w:r>
+        <w:rPr>
+          <w:rFonts w:ascii="Calibri" w:cs="Calibri" w:eastAsia="Calibri" w:hAnsi="Calibri"/>
+          <w:b/>
+          <w:bCs/>
+          <w:color w:val="111827"/>
+          <w:sz w:val="19"/>
+          <w:szCs w:val="19"/>
+        </w:rPr>
+        <w:t xml:space="preserve">SSC (Class X)</w:t>
+      </w:r>
+      <w:r>
+        <w:rPr>
+          <w:rFonts w:ascii="Calibri" w:cs="Calibri" w:eastAsia="Calibri" w:hAnsi="Calibri"/>
+          <w:color w:val="5B6474"/>
+          <w:sz w:val="19"/>
+          <w:szCs w:val="19"/>
+        </w:rPr>
+        <w:t xml:space="preserve">   Z.P. High School, Amalapadu</w:t>
+      </w:r>
+      <w:r>
+        <w:rPr>
+          <w:rFonts w:ascii="Calibri" w:cs="Calibri" w:eastAsia="Calibri" w:hAnsi="Calibri"/>
+          <w:b/>
+          <w:bCs/>
+          <w:color w:val="2563EB"/>
+          <w:sz w:val="19"/>
+          <w:szCs w:val="19"/>
+        </w:rPr>
+        <w:t xml:space="preserve">   CGPA 7.5</w:t>
+      </w:r>
+      <w:r>
+        <w:rPr>
+          <w:rFonts w:ascii="Calibri" w:cs="Calibri" w:eastAsia="Calibri" w:hAnsi="Calibri"/>
+          <w:color w:val="1F2937"/>
+          <w:sz w:val="19"/>
+          <w:szCs w:val="19"/>
+        </w:rPr>
+        <w:t xml:space="preserve">	</w:t>
+      </w:r>
+      <w:r>
+        <w:rPr>
+          <w:rFonts w:ascii="Calibri" w:cs="Calibri" w:eastAsia="Calibri" w:hAnsi="Calibri"/>
+          <w:b/>
+          <w:bCs/>
+          <w:color w:val="5B6474"/>
+          <w:sz w:val="18"/>
+          <w:szCs w:val="18"/>
+        </w:rPr>
+        <w:t xml:space="preserve">2017</w:t>
+      </w:r>
+    </w:p>
+    <w:p>
+      <w:pPr>
+        <w:keepNext/>
         <w:pBdr>
           <w:bottom w:val="single" w:color="D5DAE3" w:sz="4" w:space="3"/>
         </w:pBdr>
@@ -1720,7 +1780,7 @@
           <w:sz w:val="19"/>
           <w:szCs w:val="19"/>
         </w:rPr>
-        <w:t xml:space="preserve">AWS Cloud Intern</w:t>
+        <w:t xml:space="preserve">Data Science, ML &amp; AI Intern</w:t>
       </w:r>
       <w:r>
         <w:rPr>
@@ -1729,7 +1789,7 @@
           <w:sz w:val="19"/>
           <w:szCs w:val="19"/>
         </w:rPr>
-        <w:t xml:space="preserve">   BrainOVision Solutions</w:t>
+        <w:t xml:space="preserve">   Datavalley India, with APSCHE</w:t>
       </w:r>
       <w:r>
         <w:rPr>
@@ -1749,7 +1809,7 @@
           <w:sz w:val="18"/>
           <w:szCs w:val="18"/>
         </w:rPr>
-        <w:t xml:space="preserve">2 months</w:t>
+        <w:t xml:space="preserve">240 hrs · Completed Apr 2024</w:t>
       </w:r>
     </w:p>
     <w:p>
@@ -1768,7 +1828,7 @@
           <w:sz w:val="19"/>
           <w:szCs w:val="19"/>
         </w:rPr>
-        <w:t xml:space="preserve">Deployed apps on AWS EC2, managed S3 storage, explored IAM roles, and set up and monitored cloud infrastructure.</w:t>
+        <w:t xml:space="preserve">Worked on predictive modeling, applying ML algorithms and improving accuracy through data preprocessing.</w:t>
       </w:r>
     </w:p>
     <w:p>
@@ -1777,7 +1837,7 @@
         <w:tabs>
           <w:tab w:val="right" w:pos="10466"/>
         </w:tabs>
-        <w:spacing w:before="70" w:after="10"/>
+        <w:spacing w:before="60" w:after="10"/>
       </w:pPr>
       <w:r>
         <w:rPr>
@@ -1788,7 +1848,7 @@
           <w:sz w:val="19"/>
           <w:szCs w:val="19"/>
         </w:rPr>
-        <w:t xml:space="preserve">Data Science &amp; Machine Learning Intern</w:t>
+        <w:t xml:space="preserve">AWS Cloud Intern</w:t>
       </w:r>
       <w:r>
         <w:rPr>
@@ -1797,7 +1857,7 @@
           <w:sz w:val="19"/>
           <w:szCs w:val="19"/>
         </w:rPr>
-        <w:t xml:space="preserve">   APSCHE</w:t>
+        <w:t xml:space="preserve">   BrainOVision Solutions (AICTE)</w:t>
       </w:r>
       <w:r>
         <w:rPr>
@@ -1817,7 +1877,7 @@
           <w:sz w:val="18"/>
           <w:szCs w:val="18"/>
         </w:rPr>
-        <w:t xml:space="preserve">6 months</w:t>
+        <w:t xml:space="preserve">May 2023 – Jul 2023</w:t>
       </w:r>
     </w:p>
     <w:p>
@@ -1836,7 +1896,7 @@
           <w:sz w:val="19"/>
           <w:szCs w:val="19"/>
         </w:rPr>
-        <w:t xml:space="preserve">Worked on predictive modeling, applying ML algorithms and improving accuracy through data preprocessing.</w:t>
+        <w:t xml:space="preserve">Deployed apps on AWS EC2, managed S3 storage, explored IAM roles, and set up and monitored cloud infrastructure.</w:t>
       </w:r>
     </w:p>
     <w:p>
@@ -1845,7 +1905,7 @@
         <w:tabs>
           <w:tab w:val="right" w:pos="10466"/>
         </w:tabs>
-        <w:spacing w:before="70" w:after="10"/>
+        <w:spacing w:before="60" w:after="10"/>
       </w:pPr>
       <w:r>
         <w:rPr>
@@ -1885,7 +1945,7 @@
           <w:sz w:val="18"/>
           <w:szCs w:val="18"/>
         </w:rPr>
-        <w:t xml:space="preserve">2 months</w:t>
+        <w:t xml:space="preserve">Jun 2022 – Aug 2022</w:t>
       </w:r>
     </w:p>
     <w:p>
@@ -1913,7 +1973,7 @@
         <w:tabs>
           <w:tab w:val="right" w:pos="10466"/>
         </w:tabs>
-        <w:spacing w:before="70" w:after="10"/>
+        <w:spacing w:before="60" w:after="10"/>
       </w:pPr>
       <w:r>
         <w:rPr>
@@ -1953,7 +2013,7 @@
           <w:sz w:val="18"/>
           <w:szCs w:val="18"/>
         </w:rPr>
-        <w:t xml:space="preserve">6 months</w:t>
+        <w:t xml:space="preserve">Nov 2019 – Apr 2020</w:t>
       </w:r>
     </w:p>
     <w:p>
@@ -2002,7 +2062,7 @@
           <w:sz w:val="21"/>
           <w:szCs w:val="21"/>
         </w:rPr>
-        <w:t xml:space="preserve">CERTIFICATIONS</w:t>
+        <w:t xml:space="preserve">CERTIFICATIONS &amp; ACHIEVEMENTS</w:t>
       </w:r>
     </w:p>
     <w:tbl>
@@ -2059,7 +2119,7 @@
                 <w:sz w:val="19"/>
                 <w:szCs w:val="19"/>
               </w:rPr>
-              <w:t xml:space="preserve">Google Cloud Computing Foundations</w:t>
+              <w:t xml:space="preserve">NPTEL Cloud Computing</w:t>
             </w:r>
             <w:r>
               <w:rPr>
@@ -2068,7 +2128,7 @@
                 <w:sz w:val="19"/>
                 <w:szCs w:val="19"/>
               </w:rPr>
-              <w:t xml:space="preserve">  NPTEL</w:t>
+              <w:t xml:space="preserve">  IIT Kharagpur · Elite, 63%</w:t>
             </w:r>
           </w:p>
         </w:tc>
@@ -2109,7 +2169,7 @@
                 <w:sz w:val="19"/>
                 <w:szCs w:val="19"/>
               </w:rPr>
-              <w:t xml:space="preserve">Getting Started with Amazon Web Services</w:t>
+              <w:t xml:space="preserve">NPTEL Google Cloud Computing Foundations</w:t>
             </w:r>
             <w:r>
               <w:rPr>
@@ -2118,7 +2178,7 @@
                 <w:sz w:val="19"/>
                 <w:szCs w:val="19"/>
               </w:rPr>
-              <w:t xml:space="preserve">  SkillUp</w:t>
+              <w:t xml:space="preserve">  62%</w:t>
             </w:r>
           </w:p>
         </w:tc>
@@ -2161,7 +2221,7 @@
                 <w:sz w:val="19"/>
                 <w:szCs w:val="19"/>
               </w:rPr>
-              <w:t xml:space="preserve">Cloud Computing</w:t>
+              <w:t xml:space="preserve">Hands-on Approach to AI for Real-World Applications</w:t>
             </w:r>
             <w:r>
               <w:rPr>
@@ -2170,7 +2230,7 @@
                 <w:sz w:val="19"/>
                 <w:szCs w:val="19"/>
               </w:rPr>
-              <w:t xml:space="preserve">  NPTEL</w:t>
+              <w:t xml:space="preserve">  IIT KGP</w:t>
             </w:r>
           </w:p>
         </w:tc>
@@ -2211,7 +2271,7 @@
                 <w:sz w:val="19"/>
                 <w:szCs w:val="19"/>
               </w:rPr>
-              <w:t xml:space="preserve">FDP on Cloud Infrastructure</w:t>
+              <w:t xml:space="preserve">Deep Learning for Developers</w:t>
             </w:r>
             <w:r>
               <w:rPr>
@@ -2220,7 +2280,7 @@
                 <w:sz w:val="19"/>
                 <w:szCs w:val="19"/>
               </w:rPr>
-              <w:t xml:space="preserve">  BrainOVision</w:t>
+              <w:t xml:space="preserve">  Infosys Springboard</w:t>
             </w:r>
           </w:p>
         </w:tc>
@@ -2263,7 +2323,7 @@
                 <w:sz w:val="19"/>
                 <w:szCs w:val="19"/>
               </w:rPr>
-              <w:t xml:space="preserve">Introduction to Soft Skills</w:t>
+              <w:t xml:space="preserve">Getting Started with AWS</w:t>
             </w:r>
             <w:r>
               <w:rPr>
@@ -2272,7 +2332,7 @@
                 <w:sz w:val="19"/>
                 <w:szCs w:val="19"/>
               </w:rPr>
-              <w:t xml:space="preserve">  TCS</w:t>
+              <w:t xml:space="preserve">  SkillUp</w:t>
             </w:r>
           </w:p>
         </w:tc>
@@ -2285,14 +2345,119 @@
               <w:bottom w:val="none" w:color="FFFFFF" w:sz="0"/>
               <w:right w:val="none" w:color="FFFFFF" w:sz="0"/>
             </w:tcBorders>
+            <w:tcMar>
+              <w:top w:type="dxa" w:w="30"/>
+              <w:left w:type="dxa" w:w="0"/>
+              <w:bottom w:type="dxa" w:w="30"/>
+              <w:right w:type="dxa" w:w="120"/>
+            </w:tcMar>
           </w:tcPr>
-          <w:p/>
+          <w:p>
+            <w:r>
+              <w:rPr>
+                <w:rFonts w:ascii="Calibri" w:cs="Calibri" w:eastAsia="Calibri" w:hAnsi="Calibri"/>
+                <w:b/>
+                <w:bCs/>
+                <w:color w:val="2563EB"/>
+                <w:sz w:val="19"/>
+                <w:szCs w:val="19"/>
+              </w:rPr>
+              <w:t xml:space="preserve">✓  </w:t>
+            </w:r>
+            <w:r>
+              <w:rPr>
+                <w:rFonts w:ascii="Calibri" w:cs="Calibri" w:eastAsia="Calibri" w:hAnsi="Calibri"/>
+                <w:b/>
+                <w:bCs/>
+                <w:color w:val="111827"/>
+                <w:sz w:val="19"/>
+                <w:szCs w:val="19"/>
+              </w:rPr>
+              <w:t xml:space="preserve">FDP on Cloud Infrastructure (AWS)</w:t>
+            </w:r>
+            <w:r>
+              <w:rPr>
+                <w:rFonts w:ascii="Calibri" w:cs="Calibri" w:eastAsia="Calibri" w:hAnsi="Calibri"/>
+                <w:color w:val="5B6474"/>
+                <w:sz w:val="19"/>
+                <w:szCs w:val="19"/>
+              </w:rPr>
+              <w:t xml:space="preserve">  BrainOVision &amp; AICTE</w:t>
+            </w:r>
+          </w:p>
         </w:tc>
       </w:tr>
     </w:tbl>
+    <w:p>
+      <w:pPr>
+        <w:spacing w:before="60" w:after="10"/>
+      </w:pPr>
+      <w:r>
+        <w:rPr>
+          <w:rFonts w:ascii="Calibri" w:cs="Calibri" w:eastAsia="Calibri" w:hAnsi="Calibri"/>
+          <w:b/>
+          <w:bCs/>
+          <w:color w:val="2563EB"/>
+          <w:sz w:val="19"/>
+          <w:szCs w:val="19"/>
+        </w:rPr>
+        <w:t xml:space="preserve">★  </w:t>
+      </w:r>
+      <w:r>
+        <w:rPr>
+          <w:rFonts w:ascii="Calibri" w:cs="Calibri" w:eastAsia="Calibri" w:hAnsi="Calibri"/>
+          <w:b/>
+          <w:bCs/>
+          <w:color w:val="111827"/>
+          <w:sz w:val="19"/>
+          <w:szCs w:val="19"/>
+        </w:rPr>
+        <w:t xml:space="preserve">NPTEL Elite</w:t>
+      </w:r>
+      <w:r>
+        <w:rPr>
+          <w:rFonts w:ascii="Calibri" w:cs="Calibri" w:eastAsia="Calibri" w:hAnsi="Calibri"/>
+          <w:color w:val="1F2937"/>
+          <w:sz w:val="19"/>
+          <w:szCs w:val="19"/>
+        </w:rPr>
+        <w:t xml:space="preserve"> in Cloud Computing (IIT Kharagpur), among 11,454 certified   </w:t>
+      </w:r>
+      <w:r>
+        <w:rPr>
+          <w:rFonts w:ascii="Calibri" w:cs="Calibri" w:eastAsia="Calibri" w:hAnsi="Calibri"/>
+          <w:b/>
+          <w:bCs/>
+          <w:color w:val="2563EB"/>
+          <w:sz w:val="19"/>
+          <w:szCs w:val="19"/>
+        </w:rPr>
+        <w:t xml:space="preserve">★  </w:t>
+      </w:r>
+      <w:r>
+        <w:rPr>
+          <w:rFonts w:ascii="Calibri" w:cs="Calibri" w:eastAsia="Calibri" w:hAnsi="Calibri"/>
+          <w:b/>
+          <w:bCs/>
+          <w:color w:val="111827"/>
+          <w:sz w:val="19"/>
+          <w:szCs w:val="19"/>
+        </w:rPr>
+        <w:t xml:space="preserve">Participant:</w:t>
+      </w:r>
+      <w:r>
+        <w:rPr>
+          <w:rFonts w:ascii="Calibri" w:cs="Calibri" w:eastAsia="Calibri" w:hAnsi="Calibri"/>
+          <w:color w:val="1F2937"/>
+          <w:sz w:val="19"/>
+          <w:szCs w:val="19"/>
+        </w:rPr>
+        <w:t xml:space="preserve"> Flipkart GRiD 5.0, TVS Credit E.P.I.C 5.0</w:t>
+      </w:r>
+    </w:p>
     <w:sectPr>
       <w:pgSz w:w="11906" w:h="16838" w:orient="portrait"/>
-      <w:pgMar w:top="560" w:right="720" w:bottom="560" w:left="720" w:header="708" w:footer="708" w:gutter="0"/>
+      <w:pgMar w:top="500" w:right="720" w:bottom="460" w:left="720" w:header="708" w:footer="708" w:gutter="0"/>
       <w:pgNumType/>
       <w:docGrid w:linePitch="360"/>
     </w:sectPr>

</xml_diff>

<commit_message>
Remove achievements section from resumes and website
</commit_message>
<xml_diff>
--- a/Sarathkumar_Resume.docx
+++ b/Sarathkumar_Resume.docx
@@ -65,14 +65,14 @@
             <w:pPr>
               <w:spacing w:after="90"/>
             </w:pPr>
-            <w:hyperlink w:history="1" r:id="rId_grdnp3sjlae6lqydvtde">
+            <w:hyperlink w:history="1" r:id="rIdl8hwz8u56lhtnuktyn8mu">
               <w:r>
                 <w:drawing>
                   <wp:inline distT="0" distB="0" distL="0" distR="0">
                     <wp:extent cx="161925" cy="161925"/>
                     <wp:effectExtent t="0" r="0" b="0" l="0"/>
                     <wp:docPr id="1" name="" descr="" title="">
-                      <a:hlinkClick xmlns:a="http://schemas.openxmlformats.org/drawingml/2006/main" r:id="rId_grdnp3sjlae6lqydvtde"/>
+                      <a:hlinkClick xmlns:a="http://schemas.openxmlformats.org/drawingml/2006/main" r:id="rIdl8hwz8u56lhtnuktyn8mu"/>
                     </wp:docPr>
                     <wp:cNvGraphicFramePr>
                       <a:graphicFrameLocks xmlns:a="http://schemas.openxmlformats.org/drawingml/2006/main" noChangeAspect="1"/>
@@ -82,7 +82,7 @@
                         <pic:pic xmlns:pic="http://schemas.openxmlformats.org/drawingml/2006/picture">
                           <pic:nvPicPr>
                             <pic:cNvPr id="0" name="" descr="">
-                              <a:hlinkClick r:id="rId_grdnp3sjlae6lqydvtde"/>
+                              <a:hlinkClick r:id="rIdl8hwz8u56lhtnuktyn8mu"/>
                             </pic:cNvPr>
                             <pic:cNvPicPr>
                               <a:picLocks noChangeAspect="1" noChangeArrowheads="1"/>
@@ -189,14 +189,14 @@
               </w:rPr>
               <w:t xml:space="preserve">      </w:t>
             </w:r>
-            <w:hyperlink w:history="1" r:id="rIdfjrqtfkwt4vpwz190e_ix">
+            <w:hyperlink w:history="1" r:id="rIdrj6fxwe0fbvlp1db9kraz">
               <w:r>
                 <w:drawing>
                   <wp:inline distT="0" distB="0" distL="0" distR="0">
                     <wp:extent cx="161925" cy="161925"/>
                     <wp:effectExtent t="0" r="0" b="0" l="0"/>
                     <wp:docPr id="1" name="" descr="" title="">
-                      <a:hlinkClick xmlns:a="http://schemas.openxmlformats.org/drawingml/2006/main" r:id="rIdfjrqtfkwt4vpwz190e_ix"/>
+                      <a:hlinkClick xmlns:a="http://schemas.openxmlformats.org/drawingml/2006/main" r:id="rIdrj6fxwe0fbvlp1db9kraz"/>
                     </wp:docPr>
                     <wp:cNvGraphicFramePr>
                       <a:graphicFrameLocks xmlns:a="http://schemas.openxmlformats.org/drawingml/2006/main" noChangeAspect="1"/>
@@ -206,7 +206,7 @@
                         <pic:pic xmlns:pic="http://schemas.openxmlformats.org/drawingml/2006/picture">
                           <pic:nvPicPr>
                             <pic:cNvPr id="0" name="" descr="">
-                              <a:hlinkClick r:id="rIdfjrqtfkwt4vpwz190e_ix"/>
+                              <a:hlinkClick r:id="rIdrj6fxwe0fbvlp1db9kraz"/>
                             </pic:cNvPr>
                             <pic:cNvPicPr>
                               <a:picLocks noChangeAspect="1" noChangeArrowheads="1"/>
@@ -247,14 +247,14 @@
             </w:hyperlink>
           </w:p>
           <w:p>
-            <w:hyperlink w:history="1" r:id="rId0d39caclb_rijf9lvlv0f">
+            <w:hyperlink w:history="1" r:id="rId74yedukgactxkbjpyon9x">
               <w:r>
                 <w:drawing>
                   <wp:inline distT="0" distB="0" distL="0" distR="0">
                     <wp:extent cx="161925" cy="161925"/>
                     <wp:effectExtent t="0" r="0" b="0" l="0"/>
                     <wp:docPr id="1" name="" descr="" title="">
-                      <a:hlinkClick xmlns:a="http://schemas.openxmlformats.org/drawingml/2006/main" r:id="rId0d39caclb_rijf9lvlv0f"/>
+                      <a:hlinkClick xmlns:a="http://schemas.openxmlformats.org/drawingml/2006/main" r:id="rId74yedukgactxkbjpyon9x"/>
                     </wp:docPr>
                     <wp:cNvGraphicFramePr>
                       <a:graphicFrameLocks xmlns:a="http://schemas.openxmlformats.org/drawingml/2006/main" noChangeAspect="1"/>
@@ -264,7 +264,7 @@
                         <pic:pic xmlns:pic="http://schemas.openxmlformats.org/drawingml/2006/picture">
                           <pic:nvPicPr>
                             <pic:cNvPr id="0" name="" descr="">
-                              <a:hlinkClick r:id="rId0d39caclb_rijf9lvlv0f"/>
+                              <a:hlinkClick r:id="rId74yedukgactxkbjpyon9x"/>
                             </pic:cNvPr>
                             <pic:cNvPicPr>
                               <a:picLocks noChangeAspect="1" noChangeArrowheads="1"/>
@@ -312,14 +312,14 @@
               </w:rPr>
               <w:t xml:space="preserve">      </w:t>
             </w:r>
-            <w:hyperlink w:history="1" r:id="rId2dhkfeibz8l1kt0eedi5x">
+            <w:hyperlink w:history="1" r:id="rIdttmneit9ckuwjvg78-z25">
               <w:r>
                 <w:drawing>
                   <wp:inline distT="0" distB="0" distL="0" distR="0">
                     <wp:extent cx="161925" cy="161925"/>
                     <wp:effectExtent t="0" r="0" b="0" l="0"/>
                     <wp:docPr id="1" name="" descr="" title="">
-                      <a:hlinkClick xmlns:a="http://schemas.openxmlformats.org/drawingml/2006/main" r:id="rId2dhkfeibz8l1kt0eedi5x"/>
+                      <a:hlinkClick xmlns:a="http://schemas.openxmlformats.org/drawingml/2006/main" r:id="rIdttmneit9ckuwjvg78-z25"/>
                     </wp:docPr>
                     <wp:cNvGraphicFramePr>
                       <a:graphicFrameLocks xmlns:a="http://schemas.openxmlformats.org/drawingml/2006/main" noChangeAspect="1"/>
@@ -329,7 +329,7 @@
                         <pic:pic xmlns:pic="http://schemas.openxmlformats.org/drawingml/2006/picture">
                           <pic:nvPicPr>
                             <pic:cNvPr id="0" name="" descr="">
-                              <a:hlinkClick r:id="rId2dhkfeibz8l1kt0eedi5x"/>
+                              <a:hlinkClick r:id="rIdttmneit9ckuwjvg78-z25"/>
                             </pic:cNvPr>
                             <pic:cNvPicPr>
                               <a:picLocks noChangeAspect="1" noChangeArrowheads="1"/>
@@ -1080,7 +1080,7 @@
         </w:rPr>
         <w:t xml:space="preserve">    </w:t>
       </w:r>
-      <w:hyperlink w:history="1" r:id="rIdlwcxa9f89v3tsong53ff7">
+      <w:hyperlink w:history="1" r:id="rId1dv71bwyebql_ope427ol">
         <w:r>
           <w:rPr>
             <w:rFonts w:ascii="Calibri" w:cs="Calibri" w:eastAsia="Calibri" w:hAnsi="Calibri"/>
@@ -1100,7 +1100,7 @@
         </w:rPr>
         <w:t xml:space="preserve">  ·  </w:t>
       </w:r>
-      <w:hyperlink w:history="1" r:id="rIditpcahivsarmcebu45hij">
+      <w:hyperlink w:history="1" r:id="rId-fnuuxfsx_r28wemksc7d">
         <w:r>
           <w:rPr>
             <w:rFonts w:ascii="Calibri" w:cs="Calibri" w:eastAsia="Calibri" w:hAnsi="Calibri"/>
@@ -1243,7 +1243,7 @@
         </w:rPr>
         <w:t xml:space="preserve">    </w:t>
       </w:r>
-      <w:hyperlink w:history="1" r:id="rIdiomomqfenosp4ggkx08qu">
+      <w:hyperlink w:history="1" r:id="rIdk_hamjzxhc6q3l2mjz2ri">
         <w:r>
           <w:rPr>
             <w:rFonts w:ascii="Calibri" w:cs="Calibri" w:eastAsia="Calibri" w:hAnsi="Calibri"/>
@@ -1367,7 +1367,7 @@
         </w:rPr>
         <w:t xml:space="preserve">    </w:t>
       </w:r>
-      <w:hyperlink w:history="1" r:id="rIdoa1hkexhedzg5lf5_mzzn">
+      <w:hyperlink w:history="1" r:id="rId878egot-releufdh_cpvx">
         <w:r>
           <w:rPr>
             <w:rFonts w:ascii="Calibri" w:cs="Calibri" w:eastAsia="Calibri" w:hAnsi="Calibri"/>
@@ -2062,7 +2062,7 @@
           <w:sz w:val="21"/>
           <w:szCs w:val="21"/>
         </w:rPr>
-        <w:t xml:space="preserve">CERTIFICATIONS &amp; ACHIEVEMENTS</w:t>
+        <w:t xml:space="preserve">CERTIFICATIONS</w:t>
       </w:r>
     </w:p>
     <w:tbl>
@@ -2388,73 +2388,6 @@
         </w:tc>
       </w:tr>
     </w:tbl>
-    <w:p>
-      <w:pPr>
-        <w:spacing w:before="60" w:after="10"/>
-      </w:pPr>
-      <w:r>
-        <w:rPr>
-          <w:rFonts w:ascii="Calibri" w:cs="Calibri" w:eastAsia="Calibri" w:hAnsi="Calibri"/>
-          <w:b/>
-          <w:bCs/>
-          <w:color w:val="2563EB"/>
-          <w:sz w:val="19"/>
-          <w:szCs w:val="19"/>
-        </w:rPr>
-        <w:t xml:space="preserve">★  </w:t>
-      </w:r>
-      <w:r>
-        <w:rPr>
-          <w:rFonts w:ascii="Calibri" w:cs="Calibri" w:eastAsia="Calibri" w:hAnsi="Calibri"/>
-          <w:b/>
-          <w:bCs/>
-          <w:color w:val="111827"/>
-          <w:sz w:val="19"/>
-          <w:szCs w:val="19"/>
-        </w:rPr>
-        <w:t xml:space="preserve">NPTEL Elite</w:t>
-      </w:r>
-      <w:r>
-        <w:rPr>
-          <w:rFonts w:ascii="Calibri" w:cs="Calibri" w:eastAsia="Calibri" w:hAnsi="Calibri"/>
-          <w:color w:val="1F2937"/>
-          <w:sz w:val="19"/>
-          <w:szCs w:val="19"/>
-        </w:rPr>
-        <w:t xml:space="preserve"> in Cloud Computing (IIT Kharagpur), among 11,454 certified   </w:t>
-      </w:r>
-      <w:r>
-        <w:rPr>
-          <w:rFonts w:ascii="Calibri" w:cs="Calibri" w:eastAsia="Calibri" w:hAnsi="Calibri"/>
-          <w:b/>
-          <w:bCs/>
-          <w:color w:val="2563EB"/>
-          <w:sz w:val="19"/>
-          <w:szCs w:val="19"/>
-        </w:rPr>
-        <w:t xml:space="preserve">★  </w:t>
-      </w:r>
-      <w:r>
-        <w:rPr>
-          <w:rFonts w:ascii="Calibri" w:cs="Calibri" w:eastAsia="Calibri" w:hAnsi="Calibri"/>
-          <w:b/>
-          <w:bCs/>
-          <w:color w:val="111827"/>
-          <w:sz w:val="19"/>
-          <w:szCs w:val="19"/>
-        </w:rPr>
-        <w:t xml:space="preserve">Participant:</w:t>
-      </w:r>
-      <w:r>
-        <w:rPr>
-          <w:rFonts w:ascii="Calibri" w:cs="Calibri" w:eastAsia="Calibri" w:hAnsi="Calibri"/>
-          <w:color w:val="1F2937"/>
-          <w:sz w:val="19"/>
-          <w:szCs w:val="19"/>
-        </w:rPr>
-        <w:t xml:space="preserve"> Flipkart GRiD 5.0, TVS Credit E.P.I.C 5.0</w:t>
-      </w:r>
-    </w:p>
     <w:sectPr>
       <w:pgSz w:w="11906" w:h="16838" w:orient="portrait"/>
       <w:pgMar w:top="500" w:right="720" w:bottom="460" w:left="720" w:header="708" w:footer="708" w:gutter="0"/>

</xml_diff>

<commit_message>
Set Datavalley internship to Nov 2023 - Apr 2024 (B.Tech long-term internship)
</commit_message>
<xml_diff>
--- a/Sarathkumar_Resume.docx
+++ b/Sarathkumar_Resume.docx
@@ -65,14 +65,14 @@
             <w:pPr>
               <w:spacing w:after="90"/>
             </w:pPr>
-            <w:hyperlink w:history="1" r:id="rIdl8hwz8u56lhtnuktyn8mu">
+            <w:hyperlink w:history="1" r:id="rIdt6gbkutshjhlu7dglynad">
               <w:r>
                 <w:drawing>
                   <wp:inline distT="0" distB="0" distL="0" distR="0">
                     <wp:extent cx="161925" cy="161925"/>
                     <wp:effectExtent t="0" r="0" b="0" l="0"/>
                     <wp:docPr id="1" name="" descr="" title="">
-                      <a:hlinkClick xmlns:a="http://schemas.openxmlformats.org/drawingml/2006/main" r:id="rIdl8hwz8u56lhtnuktyn8mu"/>
+                      <a:hlinkClick xmlns:a="http://schemas.openxmlformats.org/drawingml/2006/main" r:id="rIdt6gbkutshjhlu7dglynad"/>
                     </wp:docPr>
                     <wp:cNvGraphicFramePr>
                       <a:graphicFrameLocks xmlns:a="http://schemas.openxmlformats.org/drawingml/2006/main" noChangeAspect="1"/>
@@ -82,7 +82,7 @@
                         <pic:pic xmlns:pic="http://schemas.openxmlformats.org/drawingml/2006/picture">
                           <pic:nvPicPr>
                             <pic:cNvPr id="0" name="" descr="">
-                              <a:hlinkClick r:id="rIdl8hwz8u56lhtnuktyn8mu"/>
+                              <a:hlinkClick r:id="rIdt6gbkutshjhlu7dglynad"/>
                             </pic:cNvPr>
                             <pic:cNvPicPr>
                               <a:picLocks noChangeAspect="1" noChangeArrowheads="1"/>
@@ -189,14 +189,14 @@
               </w:rPr>
               <w:t xml:space="preserve">      </w:t>
             </w:r>
-            <w:hyperlink w:history="1" r:id="rIdrj6fxwe0fbvlp1db9kraz">
+            <w:hyperlink w:history="1" r:id="rIdhs_ujdglbg11y7s_bfbtj">
               <w:r>
                 <w:drawing>
                   <wp:inline distT="0" distB="0" distL="0" distR="0">
                     <wp:extent cx="161925" cy="161925"/>
                     <wp:effectExtent t="0" r="0" b="0" l="0"/>
                     <wp:docPr id="1" name="" descr="" title="">
-                      <a:hlinkClick xmlns:a="http://schemas.openxmlformats.org/drawingml/2006/main" r:id="rIdrj6fxwe0fbvlp1db9kraz"/>
+                      <a:hlinkClick xmlns:a="http://schemas.openxmlformats.org/drawingml/2006/main" r:id="rIdhs_ujdglbg11y7s_bfbtj"/>
                     </wp:docPr>
                     <wp:cNvGraphicFramePr>
                       <a:graphicFrameLocks xmlns:a="http://schemas.openxmlformats.org/drawingml/2006/main" noChangeAspect="1"/>
@@ -206,7 +206,7 @@
                         <pic:pic xmlns:pic="http://schemas.openxmlformats.org/drawingml/2006/picture">
                           <pic:nvPicPr>
                             <pic:cNvPr id="0" name="" descr="">
-                              <a:hlinkClick r:id="rIdrj6fxwe0fbvlp1db9kraz"/>
+                              <a:hlinkClick r:id="rIdhs_ujdglbg11y7s_bfbtj"/>
                             </pic:cNvPr>
                             <pic:cNvPicPr>
                               <a:picLocks noChangeAspect="1" noChangeArrowheads="1"/>
@@ -247,14 +247,14 @@
             </w:hyperlink>
           </w:p>
           <w:p>
-            <w:hyperlink w:history="1" r:id="rId74yedukgactxkbjpyon9x">
+            <w:hyperlink w:history="1" r:id="rIdch5hx3hshpkbysb0yewxm">
               <w:r>
                 <w:drawing>
                   <wp:inline distT="0" distB="0" distL="0" distR="0">
                     <wp:extent cx="161925" cy="161925"/>
                     <wp:effectExtent t="0" r="0" b="0" l="0"/>
                     <wp:docPr id="1" name="" descr="" title="">
-                      <a:hlinkClick xmlns:a="http://schemas.openxmlformats.org/drawingml/2006/main" r:id="rId74yedukgactxkbjpyon9x"/>
+                      <a:hlinkClick xmlns:a="http://schemas.openxmlformats.org/drawingml/2006/main" r:id="rIdch5hx3hshpkbysb0yewxm"/>
                     </wp:docPr>
                     <wp:cNvGraphicFramePr>
                       <a:graphicFrameLocks xmlns:a="http://schemas.openxmlformats.org/drawingml/2006/main" noChangeAspect="1"/>
@@ -264,7 +264,7 @@
                         <pic:pic xmlns:pic="http://schemas.openxmlformats.org/drawingml/2006/picture">
                           <pic:nvPicPr>
                             <pic:cNvPr id="0" name="" descr="">
-                              <a:hlinkClick r:id="rId74yedukgactxkbjpyon9x"/>
+                              <a:hlinkClick r:id="rIdch5hx3hshpkbysb0yewxm"/>
                             </pic:cNvPr>
                             <pic:cNvPicPr>
                               <a:picLocks noChangeAspect="1" noChangeArrowheads="1"/>
@@ -312,14 +312,14 @@
               </w:rPr>
               <w:t xml:space="preserve">      </w:t>
             </w:r>
-            <w:hyperlink w:history="1" r:id="rIdttmneit9ckuwjvg78-z25">
+            <w:hyperlink w:history="1" r:id="rIdbv6q3cizaevxifqlj7hcb">
               <w:r>
                 <w:drawing>
                   <wp:inline distT="0" distB="0" distL="0" distR="0">
                     <wp:extent cx="161925" cy="161925"/>
                     <wp:effectExtent t="0" r="0" b="0" l="0"/>
                     <wp:docPr id="1" name="" descr="" title="">
-                      <a:hlinkClick xmlns:a="http://schemas.openxmlformats.org/drawingml/2006/main" r:id="rIdttmneit9ckuwjvg78-z25"/>
+                      <a:hlinkClick xmlns:a="http://schemas.openxmlformats.org/drawingml/2006/main" r:id="rIdbv6q3cizaevxifqlj7hcb"/>
                     </wp:docPr>
                     <wp:cNvGraphicFramePr>
                       <a:graphicFrameLocks xmlns:a="http://schemas.openxmlformats.org/drawingml/2006/main" noChangeAspect="1"/>
@@ -329,7 +329,7 @@
                         <pic:pic xmlns:pic="http://schemas.openxmlformats.org/drawingml/2006/picture">
                           <pic:nvPicPr>
                             <pic:cNvPr id="0" name="" descr="">
-                              <a:hlinkClick r:id="rIdttmneit9ckuwjvg78-z25"/>
+                              <a:hlinkClick r:id="rIdbv6q3cizaevxifqlj7hcb"/>
                             </pic:cNvPr>
                             <pic:cNvPicPr>
                               <a:picLocks noChangeAspect="1" noChangeArrowheads="1"/>
@@ -1080,7 +1080,7 @@
         </w:rPr>
         <w:t xml:space="preserve">    </w:t>
       </w:r>
-      <w:hyperlink w:history="1" r:id="rId1dv71bwyebql_ope427ol">
+      <w:hyperlink w:history="1" r:id="rIdtl8p4gwbkrobm4buhmtrx">
         <w:r>
           <w:rPr>
             <w:rFonts w:ascii="Calibri" w:cs="Calibri" w:eastAsia="Calibri" w:hAnsi="Calibri"/>
@@ -1100,7 +1100,7 @@
         </w:rPr>
         <w:t xml:space="preserve">  ·  </w:t>
       </w:r>
-      <w:hyperlink w:history="1" r:id="rId-fnuuxfsx_r28wemksc7d">
+      <w:hyperlink w:history="1" r:id="rIdonfkavrpeqe-5ylixjqkk">
         <w:r>
           <w:rPr>
             <w:rFonts w:ascii="Calibri" w:cs="Calibri" w:eastAsia="Calibri" w:hAnsi="Calibri"/>
@@ -1243,7 +1243,7 @@
         </w:rPr>
         <w:t xml:space="preserve">    </w:t>
       </w:r>
-      <w:hyperlink w:history="1" r:id="rIdk_hamjzxhc6q3l2mjz2ri">
+      <w:hyperlink w:history="1" r:id="rIdkjjfpsssdwu8jp0k3f9tt">
         <w:r>
           <w:rPr>
             <w:rFonts w:ascii="Calibri" w:cs="Calibri" w:eastAsia="Calibri" w:hAnsi="Calibri"/>
@@ -1367,7 +1367,7 @@
         </w:rPr>
         <w:t xml:space="preserve">    </w:t>
       </w:r>
-      <w:hyperlink w:history="1" r:id="rId878egot-releufdh_cpvx">
+      <w:hyperlink w:history="1" r:id="rIdj_wz0etqei0rue7srn-xv">
         <w:r>
           <w:rPr>
             <w:rFonts w:ascii="Calibri" w:cs="Calibri" w:eastAsia="Calibri" w:hAnsi="Calibri"/>
@@ -1794,6 +1794,17 @@
       <w:r>
         <w:rPr>
           <w:rFonts w:ascii="Calibri" w:cs="Calibri" w:eastAsia="Calibri" w:hAnsi="Calibri"/>
+          <w:i/>
+          <w:iCs/>
+          <w:color w:val="5B6474"/>
+          <w:sz w:val="19"/>
+          <w:szCs w:val="19"/>
+        </w:rPr>
+        <w:t xml:space="preserve">   B.Tech long-term internship</w:t>
+      </w:r>
+      <w:r>
+        <w:rPr>
+          <w:rFonts w:ascii="Calibri" w:cs="Calibri" w:eastAsia="Calibri" w:hAnsi="Calibri"/>
           <w:color w:val="1F2937"/>
           <w:sz w:val="19"/>
           <w:szCs w:val="19"/>
@@ -1809,7 +1820,7 @@
           <w:sz w:val="18"/>
           <w:szCs w:val="18"/>
         </w:rPr>
-        <w:t xml:space="preserve">240 hrs · Completed Apr 2024</w:t>
+        <w:t xml:space="preserve">Nov 2023 – Apr 2024</w:t>
       </w:r>
     </w:p>
     <w:p>

</xml_diff>

<commit_message>
Update LinkedIn URL to sarathkumardunnapapagari-cloudcomputing
</commit_message>
<xml_diff>
--- a/Sarathkumar_Resume.docx
+++ b/Sarathkumar_Resume.docx
@@ -65,14 +65,14 @@
             <w:pPr>
               <w:spacing w:after="90"/>
             </w:pPr>
-            <w:hyperlink w:history="1" r:id="rIdt6gbkutshjhlu7dglynad">
+            <w:hyperlink w:history="1" r:id="rId_mrj9uc2ctkkjtluef9ik">
               <w:r>
                 <w:drawing>
                   <wp:inline distT="0" distB="0" distL="0" distR="0">
                     <wp:extent cx="161925" cy="161925"/>
                     <wp:effectExtent t="0" r="0" b="0" l="0"/>
                     <wp:docPr id="1" name="" descr="" title="">
-                      <a:hlinkClick xmlns:a="http://schemas.openxmlformats.org/drawingml/2006/main" r:id="rIdt6gbkutshjhlu7dglynad"/>
+                      <a:hlinkClick xmlns:a="http://schemas.openxmlformats.org/drawingml/2006/main" r:id="rId_mrj9uc2ctkkjtluef9ik"/>
                     </wp:docPr>
                     <wp:cNvGraphicFramePr>
                       <a:graphicFrameLocks xmlns:a="http://schemas.openxmlformats.org/drawingml/2006/main" noChangeAspect="1"/>
@@ -82,7 +82,7 @@
                         <pic:pic xmlns:pic="http://schemas.openxmlformats.org/drawingml/2006/picture">
                           <pic:nvPicPr>
                             <pic:cNvPr id="0" name="" descr="">
-                              <a:hlinkClick r:id="rIdt6gbkutshjhlu7dglynad"/>
+                              <a:hlinkClick r:id="rId_mrj9uc2ctkkjtluef9ik"/>
                             </pic:cNvPr>
                             <pic:cNvPicPr>
                               <a:picLocks noChangeAspect="1" noChangeArrowheads="1"/>
@@ -189,14 +189,14 @@
               </w:rPr>
               <w:t xml:space="preserve">      </w:t>
             </w:r>
-            <w:hyperlink w:history="1" r:id="rIdhs_ujdglbg11y7s_bfbtj">
+            <w:hyperlink w:history="1" r:id="rIdueef-b5xyv_whflujlpw2">
               <w:r>
                 <w:drawing>
                   <wp:inline distT="0" distB="0" distL="0" distR="0">
                     <wp:extent cx="161925" cy="161925"/>
                     <wp:effectExtent t="0" r="0" b="0" l="0"/>
                     <wp:docPr id="1" name="" descr="" title="">
-                      <a:hlinkClick xmlns:a="http://schemas.openxmlformats.org/drawingml/2006/main" r:id="rIdhs_ujdglbg11y7s_bfbtj"/>
+                      <a:hlinkClick xmlns:a="http://schemas.openxmlformats.org/drawingml/2006/main" r:id="rIdueef-b5xyv_whflujlpw2"/>
                     </wp:docPr>
                     <wp:cNvGraphicFramePr>
                       <a:graphicFrameLocks xmlns:a="http://schemas.openxmlformats.org/drawingml/2006/main" noChangeAspect="1"/>
@@ -206,7 +206,7 @@
                         <pic:pic xmlns:pic="http://schemas.openxmlformats.org/drawingml/2006/picture">
                           <pic:nvPicPr>
                             <pic:cNvPr id="0" name="" descr="">
-                              <a:hlinkClick r:id="rIdhs_ujdglbg11y7s_bfbtj"/>
+                              <a:hlinkClick r:id="rIdueef-b5xyv_whflujlpw2"/>
                             </pic:cNvPr>
                             <pic:cNvPicPr>
                               <a:picLocks noChangeAspect="1" noChangeArrowheads="1"/>
@@ -247,14 +247,14 @@
             </w:hyperlink>
           </w:p>
           <w:p>
-            <w:hyperlink w:history="1" r:id="rIdch5hx3hshpkbysb0yewxm">
+            <w:hyperlink w:history="1" r:id="rIdhgzg6a7mwfajoud5cdxiv">
               <w:r>
                 <w:drawing>
                   <wp:inline distT="0" distB="0" distL="0" distR="0">
                     <wp:extent cx="161925" cy="161925"/>
                     <wp:effectExtent t="0" r="0" b="0" l="0"/>
                     <wp:docPr id="1" name="" descr="" title="">
-                      <a:hlinkClick xmlns:a="http://schemas.openxmlformats.org/drawingml/2006/main" r:id="rIdch5hx3hshpkbysb0yewxm"/>
+                      <a:hlinkClick xmlns:a="http://schemas.openxmlformats.org/drawingml/2006/main" r:id="rIdhgzg6a7mwfajoud5cdxiv"/>
                     </wp:docPr>
                     <wp:cNvGraphicFramePr>
                       <a:graphicFrameLocks xmlns:a="http://schemas.openxmlformats.org/drawingml/2006/main" noChangeAspect="1"/>
@@ -264,7 +264,7 @@
                         <pic:pic xmlns:pic="http://schemas.openxmlformats.org/drawingml/2006/picture">
                           <pic:nvPicPr>
                             <pic:cNvPr id="0" name="" descr="">
-                              <a:hlinkClick r:id="rIdch5hx3hshpkbysb0yewxm"/>
+                              <a:hlinkClick r:id="rIdhgzg6a7mwfajoud5cdxiv"/>
                             </pic:cNvPr>
                             <pic:cNvPicPr>
                               <a:picLocks noChangeAspect="1" noChangeArrowheads="1"/>
@@ -300,7 +300,7 @@
                   <w:sz w:val="18"/>
                   <w:szCs w:val="18"/>
                 </w:rPr>
-                <w:t xml:space="preserve">  linkedin.com/in/sarathkumar-dunnapapagari</w:t>
+                <w:t xml:space="preserve">  linkedin.com/in/sarathkumardunnapapagari-cloudcomputing</w:t>
               </w:r>
             </w:hyperlink>
             <w:r>
@@ -312,14 +312,14 @@
               </w:rPr>
               <w:t xml:space="preserve">      </w:t>
             </w:r>
-            <w:hyperlink w:history="1" r:id="rIdbv6q3cizaevxifqlj7hcb">
+            <w:hyperlink w:history="1" r:id="rIdktetfvlttjd_m-_u8dazm">
               <w:r>
                 <w:drawing>
                   <wp:inline distT="0" distB="0" distL="0" distR="0">
                     <wp:extent cx="161925" cy="161925"/>
                     <wp:effectExtent t="0" r="0" b="0" l="0"/>
                     <wp:docPr id="1" name="" descr="" title="">
-                      <a:hlinkClick xmlns:a="http://schemas.openxmlformats.org/drawingml/2006/main" r:id="rIdbv6q3cizaevxifqlj7hcb"/>
+                      <a:hlinkClick xmlns:a="http://schemas.openxmlformats.org/drawingml/2006/main" r:id="rIdktetfvlttjd_m-_u8dazm"/>
                     </wp:docPr>
                     <wp:cNvGraphicFramePr>
                       <a:graphicFrameLocks xmlns:a="http://schemas.openxmlformats.org/drawingml/2006/main" noChangeAspect="1"/>
@@ -329,7 +329,7 @@
                         <pic:pic xmlns:pic="http://schemas.openxmlformats.org/drawingml/2006/picture">
                           <pic:nvPicPr>
                             <pic:cNvPr id="0" name="" descr="">
-                              <a:hlinkClick r:id="rIdbv6q3cizaevxifqlj7hcb"/>
+                              <a:hlinkClick r:id="rIdktetfvlttjd_m-_u8dazm"/>
                             </pic:cNvPr>
                             <pic:cNvPicPr>
                               <a:picLocks noChangeAspect="1" noChangeArrowheads="1"/>
@@ -1080,7 +1080,7 @@
         </w:rPr>
         <w:t xml:space="preserve">    </w:t>
       </w:r>
-      <w:hyperlink w:history="1" r:id="rIdtl8p4gwbkrobm4buhmtrx">
+      <w:hyperlink w:history="1" r:id="rId4j8mutpmtbsa_dlnqbnq_">
         <w:r>
           <w:rPr>
             <w:rFonts w:ascii="Calibri" w:cs="Calibri" w:eastAsia="Calibri" w:hAnsi="Calibri"/>
@@ -1100,7 +1100,7 @@
         </w:rPr>
         <w:t xml:space="preserve">  ·  </w:t>
       </w:r>
-      <w:hyperlink w:history="1" r:id="rIdonfkavrpeqe-5ylixjqkk">
+      <w:hyperlink w:history="1" r:id="rIdmvp168quvs_eqpdpkeanb">
         <w:r>
           <w:rPr>
             <w:rFonts w:ascii="Calibri" w:cs="Calibri" w:eastAsia="Calibri" w:hAnsi="Calibri"/>
@@ -1243,7 +1243,7 @@
         </w:rPr>
         <w:t xml:space="preserve">    </w:t>
       </w:r>
-      <w:hyperlink w:history="1" r:id="rIdkjjfpsssdwu8jp0k3f9tt">
+      <w:hyperlink w:history="1" r:id="rIdmnpfmevdeilhvrbrblkos">
         <w:r>
           <w:rPr>
             <w:rFonts w:ascii="Calibri" w:cs="Calibri" w:eastAsia="Calibri" w:hAnsi="Calibri"/>
@@ -1367,7 +1367,7 @@
         </w:rPr>
         <w:t xml:space="preserve">    </w:t>
       </w:r>
-      <w:hyperlink w:history="1" r:id="rIdj_wz0etqei0rue7srn-xv">
+      <w:hyperlink w:history="1" r:id="rIdwbkzetmdi2zf-z0qpzrez">
         <w:r>
           <w:rPr>
             <w:rFonts w:ascii="Calibri" w:cs="Calibri" w:eastAsia="Calibri" w:hAnsi="Calibri"/>

</xml_diff>

<commit_message>
Update resume: 28 backend tests, internship wording
</commit_message>
<xml_diff>
--- a/Sarathkumar_Resume.docx
+++ b/Sarathkumar_Resume.docx
@@ -414,7 +414,7 @@
           <w:sz w:val="19"/>
           <w:szCs w:val="19"/>
         </w:rPr>
-        <w:t xml:space="preserve">M.Tech Computer Science student (CGPA 8.3) and B.Tech IT graduate with four internships in AWS cloud, Python and data science / ML. Built real-time computer vision, machine learning and full-stack projects with Python, PyTorch, YOLOv8, FastAPI and React. Eager to start my career in a full-time role and build reliable, scalable solutions.</w:t>
+        <w:t xml:space="preserve">M.Tech Computer Science student (CGPA 8.3) and B.Tech IT graduate with three internships in AWS cloud, Python and data science / ML, plus industrial training. Built real-time computer vision, machine learning and full-stack projects with Python, PyTorch, YOLOv8, FastAPI and React. Eager to start my career in a full-time role and build reliable, scalable solutions.</w:t>
       </w:r>
     </w:p>
     <w:p>
@@ -1310,7 +1310,7 @@
           <w:sz w:val="19"/>
           <w:szCs w:val="19"/>
         </w:rPr>
-        <w:t xml:space="preserve">Added explainability, PDF reports, optional LLM explanations and 14 automated backend tests; works fully without an API key.</w:t>
+        <w:t xml:space="preserve">Added explainability, PDF reports, optional LLM explanations and 28 automated backend tests; works fully without an API key.</w:t>
       </w:r>
     </w:p>
     <w:p>

</xml_diff>